<commit_message>
appendices added into docs
</commit_message>
<xml_diff>
--- a/IPR_Rana_Zeeshan_Ali_24000292.docx
+++ b/IPR_Rana_Zeeshan_Ali_24000292.docx
@@ -38,25 +38,7 @@
           <w:sz w:val="23"/>
           <w:szCs w:val="23"/>
         </w:rPr>
-        <w:t xml:space="preserve">MSc Advanced Computer </w:t>
-      </w:r>
-      <w:proofErr w:type="gramStart"/>
-      <w:r>
-        <w:rPr>
-          <w:color w:val="2E75B6"/>
-          <w:sz w:val="23"/>
-          <w:szCs w:val="23"/>
-        </w:rPr>
-        <w:t>Science  |</w:t>
-      </w:r>
-      <w:proofErr w:type="gramEnd"/>
-      <w:r>
-        <w:rPr>
-          <w:color w:val="2E75B6"/>
-          <w:sz w:val="23"/>
-          <w:szCs w:val="23"/>
-        </w:rPr>
-        <w:t xml:space="preserve">  7COM1039-0206-2025</w:t>
+        <w:t>MSc Advanced Computer Science  |  7COM1039-0206-2025</w:t>
       </w:r>
     </w:p>
     <w:p>
@@ -1929,15 +1911,7 @@
           </w:tcPr>
           <w:p>
             <w:r>
-              <w:t>SAC hyperparameter configuration file for Unity ML-</w:t>
-            </w:r>
-            <w:proofErr w:type="gramStart"/>
-            <w:r>
-              <w:t>Agents</w:t>
-            </w:r>
-            <w:proofErr w:type="gramEnd"/>
-            <w:r>
-              <w:t xml:space="preserve"> trainer</w:t>
+              <w:t>SAC hyperparameter configuration file for Unity ML-Agents trainer</w:t>
             </w:r>
           </w:p>
         </w:tc>
@@ -2035,15 +2009,7 @@
           </w:tcPr>
           <w:p>
             <w:r>
-              <w:t>PPO hyperparameter configuration file for Unity ML-</w:t>
-            </w:r>
-            <w:proofErr w:type="gramStart"/>
-            <w:r>
-              <w:t>Agents</w:t>
-            </w:r>
-            <w:proofErr w:type="gramEnd"/>
-            <w:r>
-              <w:t xml:space="preserve"> trainer</w:t>
+              <w:t>PPO hyperparameter configuration file for Unity ML-Agents trainer</w:t>
             </w:r>
           </w:p>
         </w:tc>
@@ -2839,7 +2805,21 @@
                 <w:sz w:val="20"/>
                 <w:szCs w:val="20"/>
               </w:rPr>
-              <w:t>Unity 2022 LTS</w:t>
+              <w:t>Unity 2022</w:t>
+            </w:r>
+            <w:r>
+              <w:rPr>
+                <w:sz w:val="20"/>
+                <w:szCs w:val="20"/>
+              </w:rPr>
+              <w:t>.3</w:t>
+            </w:r>
+            <w:r>
+              <w:rPr>
+                <w:sz w:val="20"/>
+                <w:szCs w:val="20"/>
+              </w:rPr>
+              <w:t xml:space="preserve"> LTS</w:t>
             </w:r>
           </w:p>
         </w:tc>
@@ -4108,15 +4088,7 @@
     </w:p>
     <w:p>
       <w:r>
-        <w:t xml:space="preserve">A further social concern is the potential for reinforcement learning policies to perform poorly or unsafely when deployed in real-world environments that differ from training conditions. This project mitigates that risk within its current scope through environment randomisation, the structural separation of Training and Testing Environments, and multi-seed validation across five independent runs. The Testing Environment </w:t>
-      </w:r>
-      <w:proofErr w:type="gramStart"/>
-      <w:r>
-        <w:t>in particular serves</w:t>
-      </w:r>
-      <w:proofErr w:type="gramEnd"/>
-      <w:r>
-        <w:t xml:space="preserve"> a direct social function: it provides empirical evidence about whether each algorithm's learned behaviour transfers beyond its training context, which is the most practically relevant question for any system intended for real-world deployment. However, the broader sim-to-real transfer problem remains an open challenge in the research community.</w:t>
+        <w:t>A further social concern is the potential for reinforcement learning policies to perform poorly or unsafely when deployed in real-world environments that differ from training conditions. This project mitigates that risk within its current scope through environment randomisation, the structural separation of Training and Testing Environments, and multi-seed validation across five independent runs. The Testing Environment in particular serves a direct social function: it provides empirical evidence about whether each algorithm's learned behaviour transfers beyond its training context, which is the most practically relevant question for any system intended for real-world deployment. However, the broader sim-to-real transfer problem remains an open challenge in the research community.</w:t>
       </w:r>
     </w:p>
     <w:p>
@@ -4132,7 +4104,19 @@
       </w:r>
       <w:r>
         <w:lastRenderedPageBreak/>
-        <w:t xml:space="preserve">individuals with unpredictable movement — populations unlikely to be represented in a simulation-only training pipeline. </w:t>
+        <w:t xml:space="preserve">individuals with unpredictable </w:t>
+      </w:r>
+      <w:r>
+        <w:t>movement populations</w:t>
+      </w:r>
+      <w:r>
+        <w:t xml:space="preserve"> unlikely to be represented in a simulation</w:t>
+      </w:r>
+      <w:r>
+        <w:t xml:space="preserve"> </w:t>
+      </w:r>
+      <w:r>
+        <w:t xml:space="preserve">only training pipeline. </w:t>
       </w:r>
     </w:p>
     <w:p>
@@ -4180,15 +4164,7 @@
         <w:jc w:val="both"/>
       </w:pPr>
       <w:r>
-        <w:t xml:space="preserve">The structural separation between the Training Environment and the Testing Environment also introduces a one-directional data flow discipline into the project management approach. Algorithm configuration and hyperparameter decisions are made </w:t>
-      </w:r>
-      <w:proofErr w:type="gramStart"/>
-      <w:r>
-        <w:t>on the basis of</w:t>
-      </w:r>
-      <w:proofErr w:type="gramEnd"/>
-      <w:r>
-        <w:t xml:space="preserve"> Training Environment results only; the Testing Environment is held in reserve until all training is complete, ensuring that no information from the Testing Environment influences training decisions. This prevents inadvertent optimisation toward the test conditions and is enforced as a project management constraint as well as a methodological one. In practice, this means the Testing Environment Unity scene file will not be constructed until all five seeds per algorithm have completed training, all hyperparameter decisions have been locked, and no further modifications to the reward function or agent configuration are made. This sequencing will be documented explicitly in the final report so that the generalisation claim can be independently verified.</w:t>
+        <w:t>The structural separation between the Training Environment and the Testing Environment also introduces a one-directional data flow discipline into the project management approach. Algorithm configuration and hyperparameter decisions are made on the basis of Training Environment results only; the Testing Environment is held in reserve until all training is complete, ensuring that no information from the Testing Environment influences training decisions. This prevents inadvertent optimisation toward the test conditions and is enforced as a project management constraint as well as a methodological one. In practice, this means the Testing Environment Unity scene file will not be constructed until all five seeds per algorithm have completed training, all hyperparameter decisions have been locked, and no further modifications to the reward function or agent configuration are made. This sequencing will be documented explicitly in the final report so that the generalisation claim can be independently verified.</w:t>
       </w:r>
     </w:p>
     <w:p>
@@ -4702,23 +4678,7 @@
                 <w:sz w:val="20"/>
                 <w:szCs w:val="20"/>
               </w:rPr>
-              <w:t xml:space="preserve">Training time per seed estimated at 4–8 hours depending on algorithm; 15 total runs scheduled sequentially. Compute time will be benchmarked during Week 1 SAC runs; if training exceeds budget, the training step limit will be reduced with a transparent </w:t>
-            </w:r>
-            <w:proofErr w:type="gramStart"/>
-            <w:r>
-              <w:rPr>
-                <w:sz w:val="20"/>
-                <w:szCs w:val="20"/>
-              </w:rPr>
-              <w:t>justification, or</w:t>
-            </w:r>
-            <w:proofErr w:type="gramEnd"/>
-            <w:r>
-              <w:rPr>
-                <w:sz w:val="20"/>
-                <w:szCs w:val="20"/>
-              </w:rPr>
-              <w:t xml:space="preserve"> runs will be </w:t>
+              <w:t xml:space="preserve">Training time per seed estimated at 4–8 hours depending on algorithm; 15 total runs scheduled sequentially. Compute time will be benchmarked during Week 1 SAC runs; if training exceeds budget, the training step limit will be reduced with a transparent justification, or runs will be </w:t>
             </w:r>
             <w:r>
               <w:rPr>
@@ -5118,15 +5078,7 @@
         <w:jc w:val="both"/>
       </w:pPr>
       <w:r>
-        <w:t xml:space="preserve">Process quality is maintained through disciplined version control, documented hyperparameter choices, reproducible random seed management, and consistent use of the same evaluation scripts across all </w:t>
-      </w:r>
-      <w:proofErr w:type="gramStart"/>
-      <w:r>
-        <w:t>algorithm</w:t>
-      </w:r>
-      <w:proofErr w:type="gramEnd"/>
-      <w:r>
-        <w:t xml:space="preserve"> runs in both environments. Before each algorithm’s training begins, a pre-run consistency checklist is completed to verify that the reward function parameters, episode length limits, training budget (measured in environment steps rather than episodes, to account for differences in episode duration across algorithms), and environment random seed configuration are identical across SAC, PPO, and DQN. Each training run is validated by checking that TensorBoard curves show the expected learning progression before results are accepted as valid data points for statistical analysis. The Testing Environment is kept strictly isolated from all training decisions until the training phase is complete.</w:t>
+        <w:t>Process quality is maintained through disciplined version control, documented hyperparameter choices, reproducible random seed management, and consistent use of the same evaluation scripts across all algorithm runs in both environments. Before each algorithm’s training begins, a pre-run consistency checklist is completed to verify that the reward function parameters, episode length limits, training budget (measured in environment steps rather than episodes, to account for differences in episode duration across algorithms), and environment random seed configuration are identical across SAC, PPO, and DQN. Each training run is validated by checking that TensorBoard curves show the expected learning progression before results are accepted as valid data points for statistical analysis. The Testing Environment is kept strictly isolated from all training decisions until the training phase is complete.</w:t>
       </w:r>
     </w:p>
     <w:p>
@@ -5146,27 +5098,31 @@
     </w:p>
     <w:p>
       <w:pPr>
-        <w:pStyle w:val="Heading2"/>
-      </w:pPr>
-      <w:r>
-        <w:t>4.4 Remaining Tasks and Target Timeline</w:t>
-      </w:r>
-    </w:p>
-    <w:p>
-      <w:pPr>
         <w:spacing w:before="80" w:after="100"/>
         <w:jc w:val="both"/>
       </w:pPr>
-      <w:r>
-        <w:t xml:space="preserve">The table below presents the project plan for the 8 weeks remaining after submission of this Interim Progress Report. Tasks are scheduled sequentially as each phase depends directly on the completion of its predecessor. There is no slack in the schedule; any delay </w:t>
-      </w:r>
-      <w:proofErr w:type="gramStart"/>
-      <w:r>
-        <w:t>in a given</w:t>
-      </w:r>
-      <w:proofErr w:type="gramEnd"/>
-      <w:r>
-        <w:t xml:space="preserve"> week will affect the final submission date.</w:t>
+    </w:p>
+    <w:p>
+      <w:pPr>
+        <w:spacing w:before="80" w:after="100"/>
+        <w:jc w:val="both"/>
+      </w:pPr>
+    </w:p>
+    <w:p>
+      <w:pPr>
+        <w:pStyle w:val="Heading2"/>
+      </w:pPr>
+      <w:r>
+        <w:t>4.4 Remaining Tasks and Target Timeline</w:t>
+      </w:r>
+    </w:p>
+    <w:p>
+      <w:pPr>
+        <w:spacing w:before="80" w:after="100"/>
+        <w:jc w:val="both"/>
+      </w:pPr>
+      <w:r>
+        <w:t>The table below presents the project plan for the 8 weeks remaining after submission of this Interim Progress Report. Tasks are scheduled sequentially as each phase depends directly on the completion of its predecessor. There is no slack in the schedule; any delay in a given week will affect the final submission date.</w:t>
       </w:r>
     </w:p>
     <w:p>
@@ -5232,6 +5188,7 @@
                 <w:sz w:val="20"/>
                 <w:szCs w:val="20"/>
               </w:rPr>
+              <w:lastRenderedPageBreak/>
               <w:t>Week</w:t>
             </w:r>
           </w:p>
@@ -5484,15 +5441,7 @@
                 <w:sz w:val="20"/>
                 <w:szCs w:val="20"/>
               </w:rPr>
-              <w:t xml:space="preserve">SAC training logs; Python console output confirming </w:t>
-            </w:r>
-            <w:r>
-              <w:rPr>
-                <w:sz w:val="20"/>
-                <w:szCs w:val="20"/>
-              </w:rPr>
-              <w:lastRenderedPageBreak/>
-              <w:t>stable learning across all 5 seeds.</w:t>
+              <w:t>SAC training logs; Python console output confirming stable learning across all 5 seeds.</w:t>
             </w:r>
           </w:p>
         </w:tc>
@@ -5519,16 +5468,7 @@
                 <w:sz w:val="20"/>
                 <w:szCs w:val="20"/>
               </w:rPr>
-              <w:lastRenderedPageBreak/>
-              <w:t xml:space="preserve">Training Environment and reward function </w:t>
-            </w:r>
-            <w:r>
-              <w:rPr>
-                <w:sz w:val="20"/>
-                <w:szCs w:val="20"/>
-              </w:rPr>
-              <w:lastRenderedPageBreak/>
-              <w:t>complete (done at IPR stage)</w:t>
+              <w:t>Training Environment and reward function complete (done at IPR stage)</w:t>
             </w:r>
           </w:p>
         </w:tc>
@@ -5559,7 +5499,6 @@
                 <w:sz w:val="20"/>
                 <w:szCs w:val="20"/>
               </w:rPr>
-              <w:lastRenderedPageBreak/>
               <w:t>Week 2</w:t>
             </w:r>
           </w:p>
@@ -5958,23 +5897,7 @@
                 <w:sz w:val="20"/>
                 <w:szCs w:val="20"/>
               </w:rPr>
-              <w:t xml:space="preserve">All </w:t>
-            </w:r>
-            <w:proofErr w:type="gramStart"/>
-            <w:r>
-              <w:rPr>
-                <w:sz w:val="20"/>
-                <w:szCs w:val="20"/>
-              </w:rPr>
-              <w:t>three algorithm</w:t>
-            </w:r>
-            <w:proofErr w:type="gramEnd"/>
-            <w:r>
-              <w:rPr>
-                <w:sz w:val="20"/>
-                <w:szCs w:val="20"/>
-              </w:rPr>
-              <w:t xml:space="preserve"> training complete (Weeks 1-3)</w:t>
+              <w:t>All three algorithm training complete (Weeks 1-3)</w:t>
             </w:r>
           </w:p>
         </w:tc>
@@ -6571,6 +6494,90 @@
     <w:p>
       <w:pPr>
         <w:spacing w:before="80"/>
+      </w:pPr>
+    </w:p>
+    <w:p>
+      <w:pPr>
+        <w:spacing w:before="80"/>
+        <w:rPr>
+          <w:b/>
+          <w:bCs/>
+          <w:color w:val="2E75B6"/>
+          <w:sz w:val="26"/>
+          <w:szCs w:val="26"/>
+        </w:rPr>
+      </w:pPr>
+    </w:p>
+    <w:p>
+      <w:pPr>
+        <w:spacing w:before="80"/>
+        <w:rPr>
+          <w:b/>
+          <w:bCs/>
+          <w:color w:val="2E75B6"/>
+          <w:sz w:val="26"/>
+          <w:szCs w:val="26"/>
+        </w:rPr>
+      </w:pPr>
+    </w:p>
+    <w:p>
+      <w:pPr>
+        <w:spacing w:before="80"/>
+        <w:rPr>
+          <w:b/>
+          <w:bCs/>
+          <w:color w:val="2E75B6"/>
+          <w:sz w:val="26"/>
+          <w:szCs w:val="26"/>
+        </w:rPr>
+      </w:pPr>
+    </w:p>
+    <w:p>
+      <w:pPr>
+        <w:spacing w:before="80"/>
+        <w:rPr>
+          <w:b/>
+          <w:bCs/>
+          <w:color w:val="2E75B6"/>
+          <w:sz w:val="26"/>
+          <w:szCs w:val="26"/>
+        </w:rPr>
+      </w:pPr>
+    </w:p>
+    <w:p>
+      <w:pPr>
+        <w:spacing w:before="80"/>
+        <w:rPr>
+          <w:b/>
+          <w:bCs/>
+          <w:color w:val="2E75B6"/>
+          <w:sz w:val="26"/>
+          <w:szCs w:val="26"/>
+        </w:rPr>
+      </w:pPr>
+    </w:p>
+    <w:p>
+      <w:pPr>
+        <w:spacing w:before="80"/>
+        <w:rPr>
+          <w:b/>
+          <w:bCs/>
+          <w:color w:val="2E75B6"/>
+          <w:sz w:val="26"/>
+          <w:szCs w:val="26"/>
+        </w:rPr>
+      </w:pPr>
+    </w:p>
+    <w:p>
+      <w:pPr>
+        <w:spacing w:before="80"/>
+        <w:rPr>
+          <w:b/>
+          <w:bCs/>
+          <w:color w:val="2E75B6"/>
+          <w:sz w:val="26"/>
+          <w:szCs w:val="26"/>
+        </w:rPr>
       </w:pPr>
     </w:p>
     <w:p>
@@ -8271,7 +8278,6 @@
                 <w:sz w:val="18"/>
                 <w:szCs w:val="18"/>
               </w:rPr>
-              <w:lastRenderedPageBreak/>
               <w:t>Evaluation</w:t>
             </w:r>
           </w:p>
@@ -9884,15 +9890,7 @@
     </w:p>
     <w:p>
       <w:r>
-        <w:t xml:space="preserve">The table below documents which tasks are dependent on the completion of earlier </w:t>
-      </w:r>
-      <w:proofErr w:type="gramStart"/>
-      <w:r>
-        <w:t>tasks, and</w:t>
-      </w:r>
-      <w:proofErr w:type="gramEnd"/>
-      <w:r>
-        <w:t xml:space="preserve"> explains why each dependency exists. No task should begin until its predecessor is fully complete and its outputs verified.</w:t>
+        <w:t>The table below documents which tasks are dependent on the completion of earlier tasks, and explains why each dependency exists. No task should begin until its predecessor is fully complete and its outputs verified.</w:t>
       </w:r>
     </w:p>
     <w:p>
@@ -10104,23 +10102,7 @@
                 <w:sz w:val="20"/>
                 <w:szCs w:val="20"/>
               </w:rPr>
-              <w:t>Training is scheduled sequentially to avoid Unity ML-</w:t>
-            </w:r>
-            <w:proofErr w:type="gramStart"/>
-            <w:r>
-              <w:rPr>
-                <w:sz w:val="20"/>
-                <w:szCs w:val="20"/>
-              </w:rPr>
-              <w:t>Agents</w:t>
-            </w:r>
-            <w:proofErr w:type="gramEnd"/>
-            <w:r>
-              <w:rPr>
-                <w:sz w:val="20"/>
-                <w:szCs w:val="20"/>
-              </w:rPr>
-              <w:t xml:space="preserve"> memory conflicts.</w:t>
+              <w:t>Training is scheduled sequentially to avoid Unity ML-Agents memory conflicts.</w:t>
             </w:r>
           </w:p>
         </w:tc>
@@ -10259,23 +10241,7 @@
                 <w:sz w:val="20"/>
                 <w:szCs w:val="20"/>
               </w:rPr>
-              <w:t xml:space="preserve">All </w:t>
-            </w:r>
-            <w:proofErr w:type="gramStart"/>
-            <w:r>
-              <w:rPr>
-                <w:sz w:val="20"/>
-                <w:szCs w:val="20"/>
-              </w:rPr>
-              <w:t>three algorithm</w:t>
-            </w:r>
-            <w:proofErr w:type="gramEnd"/>
-            <w:r>
-              <w:rPr>
-                <w:sz w:val="20"/>
-                <w:szCs w:val="20"/>
-              </w:rPr>
-              <w:t xml:space="preserve"> training complete</w:t>
+              <w:t>All three algorithm training complete</w:t>
             </w:r>
           </w:p>
         </w:tc>
@@ -12198,7 +12164,7 @@
         <w:jc w:val="both"/>
       </w:pPr>
       <w:r>
-        <w:t>Autonomous navigation using deep reinforcement learning sits at the intersection of artificial intelligence and robotics, two areas I find genuinely compelling. The problem of enabling an agent to learn purposeful behaviour through experience alone, without explicitly programmed rules, has significant practical value across autonomous vehicles, intelligent logistics, and robotics engineering — sectors in which I intend to pursue a career. This project provides directly relevant experience in designing, implementing, and rigorously evaluating competing learning algorithms.</w:t>
+        <w:t>Autonomous navigation using deep reinforcement learning sits at the intersection of artificial intelligence and robotics, two areas I find genuinely compelling. The problem of enabling an agent to learn purposeful behaviour through experience alone, without explicitly programmed rules, has significant practical value across autonomous vehicles, intelligent logistics, and robotics engineering sectors in which I intend to pursue a career. This project provides directly relevant experience in designing, implementing, and rigorously evaluating competing learning algorithms.</w:t>
       </w:r>
     </w:p>
     <w:p>
@@ -12207,7 +12173,7 @@
         <w:jc w:val="both"/>
       </w:pPr>
       <w:r>
-        <w:t>SAC was chosen as the primary algorithm because its entropy-based generalisation advantage has not been fully tested in Unity-based robot navigation — making the comparison with PPO and DQN a question with genuine research value rather than a replication of existing work.</w:t>
+        <w:t>SAC was chosen as the primary algorithm because its entropy-based generalisation advantage has not been fully tested in Unity-based robot navigation making the comparison with PPO and DQN a question with genuine research value rather than a replication of existing work.</w:t>
       </w:r>
     </w:p>
     <w:p>
@@ -12286,15 +12252,19 @@
         <w:jc w:val="both"/>
       </w:pPr>
       <w:r>
-        <w:t xml:space="preserve">This level of methodological traceability — from research question to comparator selection, reward design, and statistical framework — is what allows the </w:t>
-      </w:r>
-      <w:proofErr w:type="gramStart"/>
-      <w:r>
-        <w:t>final results</w:t>
-      </w:r>
-      <w:proofErr w:type="gramEnd"/>
-      <w:r>
-        <w:t xml:space="preserve"> to be interpreted with confidence rather than treated as incidental observations.</w:t>
+        <w:t>This level of methodological traceability</w:t>
+      </w:r>
+      <w:r>
+        <w:t xml:space="preserve"> </w:t>
+      </w:r>
+      <w:r>
+        <w:t>from research question to comparator selection, reward design, and statistical framework</w:t>
+      </w:r>
+      <w:r>
+        <w:t xml:space="preserve"> </w:t>
+      </w:r>
+      <w:r>
+        <w:t>is what allows the final results to be interpreted with confidence rather than treated as incidental observations.</w:t>
       </w:r>
     </w:p>
     <w:p>
@@ -12618,6 +12588,515 @@
       </w:pPr>
       <w:r>
         <w:t>Appendix A: Unity Navigation Environment</w:t>
+      </w:r>
+    </w:p>
+    <w:p>
+      <w:pPr>
+        <w:spacing w:before="60" w:after="160"/>
+        <w:jc w:val="center"/>
+        <w:rPr>
+          <w:i/>
+          <w:iCs/>
+          <w:color w:val="777777"/>
+          <w:sz w:val="19"/>
+          <w:szCs w:val="19"/>
+        </w:rPr>
+      </w:pPr>
+      <w:r>
+        <w:rPr>
+          <w:noProof/>
+        </w:rPr>
+        <w:drawing>
+          <wp:inline distT="0" distB="0" distL="0" distR="0" wp14:anchorId="5F6F23D3" wp14:editId="182377B0">
+            <wp:extent cx="4396740" cy="4342870"/>
+            <wp:effectExtent l="0" t="0" r="3810" b="635"/>
+            <wp:docPr id="2032687658" name="Picture 2"/>
+            <wp:cNvGraphicFramePr>
+              <a:graphicFrameLocks xmlns:a="http://schemas.openxmlformats.org/drawingml/2006/main" noChangeAspect="1"/>
+            </wp:cNvGraphicFramePr>
+            <a:graphic xmlns:a="http://schemas.openxmlformats.org/drawingml/2006/main">
+              <a:graphicData uri="http://schemas.openxmlformats.org/drawingml/2006/picture">
+                <pic:pic xmlns:pic="http://schemas.openxmlformats.org/drawingml/2006/picture">
+                  <pic:nvPicPr>
+                    <pic:cNvPr id="2032687658" name="Picture 2032687658"/>
+                    <pic:cNvPicPr/>
+                  </pic:nvPicPr>
+                  <pic:blipFill>
+                    <a:blip r:embed="rId13" cstate="print">
+                      <a:extLst>
+                        <a:ext uri="{28A0092B-C50C-407E-A947-70E740481C1C}">
+                          <a14:useLocalDpi xmlns:a14="http://schemas.microsoft.com/office/drawing/2010/main" val="0"/>
+                        </a:ext>
+                      </a:extLst>
+                    </a:blip>
+                    <a:stretch>
+                      <a:fillRect/>
+                    </a:stretch>
+                  </pic:blipFill>
+                  <pic:spPr>
+                    <a:xfrm>
+                      <a:off x="0" y="0"/>
+                      <a:ext cx="4412427" cy="4358364"/>
+                    </a:xfrm>
+                    <a:prstGeom prst="rect">
+                      <a:avLst/>
+                    </a:prstGeom>
+                  </pic:spPr>
+                </pic:pic>
+              </a:graphicData>
+            </a:graphic>
+          </wp:inline>
+        </w:drawing>
+      </w:r>
+    </w:p>
+    <w:p>
+      <w:pPr>
+        <w:spacing w:before="60" w:after="160"/>
+        <w:jc w:val="center"/>
+        <w:rPr>
+          <w:i/>
+          <w:iCs/>
+          <w:color w:val="777777"/>
+          <w:sz w:val="19"/>
+          <w:szCs w:val="19"/>
+        </w:rPr>
+      </w:pPr>
+      <w:r>
+        <w:rPr>
+          <w:i/>
+          <w:iCs/>
+          <w:color w:val="777777"/>
+          <w:sz w:val="19"/>
+          <w:szCs w:val="19"/>
+        </w:rPr>
+        <w:t xml:space="preserve">Figure A1. Training Environment — dynamic arena with randomised obstacle placement and randomised target positions. The Testing </w:t>
+      </w:r>
+      <w:r>
+        <w:rPr>
+          <w:i/>
+          <w:iCs/>
+          <w:color w:val="777777"/>
+          <w:sz w:val="20"/>
+          <w:szCs w:val="20"/>
+        </w:rPr>
+        <w:t>Environm</w:t>
+      </w:r>
+      <w:r>
+        <w:rPr>
+          <w:i/>
+          <w:iCs/>
+          <w:color w:val="777777"/>
+          <w:sz w:val="19"/>
+          <w:szCs w:val="19"/>
+        </w:rPr>
+        <w:t>ent has not yet been constructed at this stage of the project.</w:t>
+      </w:r>
+    </w:p>
+    <w:p>
+      <w:pPr>
+        <w:spacing w:before="60" w:after="160"/>
+      </w:pPr>
+      <w:r>
+        <w:rPr>
+          <w:b/>
+          <w:bCs/>
+        </w:rPr>
+        <w:t xml:space="preserve">Appendix B: </w:t>
+      </w:r>
+    </w:p>
+    <w:p>
+      <w:pPr>
+        <w:spacing w:before="60" w:after="160"/>
+      </w:pPr>
+    </w:p>
+    <w:p>
+      <w:pPr>
+        <w:spacing w:before="100"/>
+      </w:pPr>
+    </w:p>
+    <w:p>
+      <w:pPr>
+        <w:pStyle w:val="Heading2"/>
+      </w:pPr>
+      <w:r>
+        <w:t>Appendix B: SAC Initial Training Output</w:t>
+      </w:r>
+    </w:p>
+    <w:p>
+      <w:pPr>
+        <w:spacing w:before="60" w:after="160"/>
+        <w:rPr>
+          <w:color w:val="747474" w:themeColor="background2" w:themeShade="80"/>
+          <w:sz w:val="20"/>
+          <w:szCs w:val="20"/>
+        </w:rPr>
+      </w:pPr>
+      <w:r>
+        <w:rPr>
+          <w:i/>
+          <w:iCs/>
+          <w:color w:val="747474" w:themeColor="background2" w:themeShade="80"/>
+          <w:sz w:val="20"/>
+          <w:szCs w:val="20"/>
+        </w:rPr>
+        <w:t>Figure B1. Python console output confirming successful communication between the Unity Training Environment and the SAC training pipeline. Initial training runs show the agent beginning to learn goal-directed behaviour. Full multi-seed training and TensorBoard analysis are planned for the next phase.</w:t>
+      </w:r>
+    </w:p>
+    <w:p>
+      <w:pPr>
+        <w:spacing w:before="60" w:after="160"/>
+        <w:jc w:val="center"/>
+        <w:rPr>
+          <w:color w:val="747474" w:themeColor="background2" w:themeShade="80"/>
+        </w:rPr>
+      </w:pPr>
+      <w:r>
+        <w:rPr>
+          <w:i/>
+          <w:iCs/>
+          <w:color w:val="747474" w:themeColor="background2" w:themeShade="80"/>
+          <w:sz w:val="19"/>
+          <w:szCs w:val="19"/>
+        </w:rPr>
+        <w:t>.</w:t>
+      </w:r>
+    </w:p>
+    <w:p>
+      <w:pPr>
+        <w:spacing w:before="100"/>
+      </w:pPr>
+    </w:p>
+    <w:p>
+      <w:pPr>
+        <w:pStyle w:val="Heading2"/>
+      </w:pPr>
+    </w:p>
+    <w:p>
+      <w:pPr>
+        <w:pStyle w:val="Heading2"/>
+      </w:pPr>
+    </w:p>
+    <w:p>
+      <w:pPr>
+        <w:pStyle w:val="Heading2"/>
+      </w:pPr>
+      <w:r>
+        <w:t>Appendix C: DQN Q-Network Architecture</w:t>
+      </w:r>
+    </w:p>
+    <w:p>
+      <w:pPr>
+        <w:spacing w:before="60" w:after="160"/>
+        <w:jc w:val="center"/>
+        <w:rPr>
+          <w:i/>
+          <w:iCs/>
+          <w:color w:val="777777"/>
+          <w:sz w:val="19"/>
+          <w:szCs w:val="19"/>
+        </w:rPr>
+      </w:pPr>
+      <w:r>
+        <w:rPr>
+          <w:noProof/>
+        </w:rPr>
+        <w:lastRenderedPageBreak/>
+        <w:drawing>
+          <wp:inline distT="0" distB="0" distL="0" distR="0" wp14:anchorId="1E4F4F18" wp14:editId="639A1299">
+            <wp:extent cx="4785360" cy="2793396"/>
+            <wp:effectExtent l="0" t="0" r="0" b="6985"/>
+            <wp:docPr id="936170190" name="Picture 1"/>
+            <wp:cNvGraphicFramePr>
+              <a:graphicFrameLocks xmlns:a="http://schemas.openxmlformats.org/drawingml/2006/main" noChangeAspect="1"/>
+            </wp:cNvGraphicFramePr>
+            <a:graphic xmlns:a="http://schemas.openxmlformats.org/drawingml/2006/main">
+              <a:graphicData uri="http://schemas.openxmlformats.org/drawingml/2006/picture">
+                <pic:pic xmlns:pic="http://schemas.openxmlformats.org/drawingml/2006/picture">
+                  <pic:nvPicPr>
+                    <pic:cNvPr id="936170190" name="Picture 936170190"/>
+                    <pic:cNvPicPr/>
+                  </pic:nvPicPr>
+                  <pic:blipFill>
+                    <a:blip r:embed="rId14" cstate="print">
+                      <a:extLst>
+                        <a:ext uri="{28A0092B-C50C-407E-A947-70E740481C1C}">
+                          <a14:useLocalDpi xmlns:a14="http://schemas.microsoft.com/office/drawing/2010/main" val="0"/>
+                        </a:ext>
+                      </a:extLst>
+                    </a:blip>
+                    <a:stretch>
+                      <a:fillRect/>
+                    </a:stretch>
+                  </pic:blipFill>
+                  <pic:spPr>
+                    <a:xfrm>
+                      <a:off x="0" y="0"/>
+                      <a:ext cx="4816698" cy="2811689"/>
+                    </a:xfrm>
+                    <a:prstGeom prst="rect">
+                      <a:avLst/>
+                    </a:prstGeom>
+                  </pic:spPr>
+                </pic:pic>
+              </a:graphicData>
+            </a:graphic>
+          </wp:inline>
+        </w:drawing>
+      </w:r>
+    </w:p>
+    <w:p>
+      <w:pPr>
+        <w:spacing w:before="60" w:after="160"/>
+        <w:jc w:val="center"/>
+        <w:rPr>
+          <w:i/>
+          <w:iCs/>
+          <w:color w:val="777777"/>
+          <w:sz w:val="19"/>
+          <w:szCs w:val="19"/>
+        </w:rPr>
+      </w:pPr>
+      <w:r>
+        <w:rPr>
+          <w:i/>
+          <w:iCs/>
+          <w:color w:val="777777"/>
+          <w:sz w:val="19"/>
+          <w:szCs w:val="19"/>
+        </w:rPr>
+        <w:t xml:space="preserve">Figure C1. DQN Q-network architecture implemented in PyTorch. Input layer: 14 observations (12 </w:t>
+      </w:r>
+      <w:proofErr w:type="spellStart"/>
+      <w:r>
+        <w:rPr>
+          <w:i/>
+          <w:iCs/>
+          <w:color w:val="777777"/>
+          <w:sz w:val="19"/>
+          <w:szCs w:val="19"/>
+        </w:rPr>
+        <w:t>raycasts</w:t>
+      </w:r>
+      <w:proofErr w:type="spellEnd"/>
+      <w:r>
+        <w:rPr>
+          <w:i/>
+          <w:iCs/>
+          <w:color w:val="777777"/>
+          <w:sz w:val="19"/>
+          <w:szCs w:val="19"/>
+        </w:rPr>
+        <w:t xml:space="preserve">, distance to target, bearing to target). Hidden layers: two fully connected layers of 128 units each with </w:t>
+      </w:r>
+      <w:proofErr w:type="spellStart"/>
+      <w:r>
+        <w:rPr>
+          <w:i/>
+          <w:iCs/>
+          <w:color w:val="777777"/>
+          <w:sz w:val="19"/>
+          <w:szCs w:val="19"/>
+        </w:rPr>
+        <w:t>ReLU</w:t>
+      </w:r>
+      <w:proofErr w:type="spellEnd"/>
+      <w:r>
+        <w:rPr>
+          <w:i/>
+          <w:iCs/>
+          <w:color w:val="777777"/>
+          <w:sz w:val="19"/>
+          <w:szCs w:val="19"/>
+        </w:rPr>
+        <w:t xml:space="preserve"> activation. Output layer: 4 Q-values corresponding to discrete actions.</w:t>
+      </w:r>
+    </w:p>
+    <w:p>
+      <w:pPr>
+        <w:spacing w:before="100"/>
+      </w:pPr>
+    </w:p>
+    <w:p>
+      <w:pPr>
+        <w:pStyle w:val="Heading2"/>
+      </w:pPr>
+      <w:r>
+        <w:t>Appendix D: Code Snippets</w:t>
+      </w:r>
+    </w:p>
+    <w:p>
+      <w:pPr>
+        <w:pStyle w:val="Heading3"/>
+      </w:pPr>
+      <w:r>
+        <w:t>D.1 Reward Function (AgentNavigation.cs)</w:t>
+      </w:r>
+    </w:p>
+    <w:p>
+      <w:pPr>
+        <w:spacing w:before="100"/>
+        <w:rPr>
+          <w:b/>
+          <w:bCs/>
+          <w:color w:val="1F3864"/>
+          <w:sz w:val="23"/>
+          <w:szCs w:val="23"/>
+        </w:rPr>
+      </w:pPr>
+      <w:r>
+        <w:rPr>
+          <w:b/>
+          <w:bCs/>
+          <w:color w:val="1F3864"/>
+          <w:sz w:val="23"/>
+          <w:szCs w:val="23"/>
+        </w:rPr>
+        <w:t>[ INSERT: Code snippet of the reward function in C# showing distance-shaping reward, goal-reached bonus, collision penalty, and time penalty. ]</w:t>
+      </w:r>
+    </w:p>
+    <w:p>
+      <w:pPr>
+        <w:spacing w:before="100"/>
+        <w:rPr>
+          <w:b/>
+          <w:bCs/>
+          <w:color w:val="1F3864"/>
+          <w:sz w:val="23"/>
+          <w:szCs w:val="23"/>
+        </w:rPr>
+      </w:pPr>
+    </w:p>
+    <w:p>
+      <w:pPr>
+        <w:spacing w:before="100"/>
+        <w:rPr>
+          <w:b/>
+          <w:bCs/>
+          <w:color w:val="1F3864"/>
+          <w:sz w:val="23"/>
+          <w:szCs w:val="23"/>
+        </w:rPr>
+      </w:pPr>
+    </w:p>
+    <w:p>
+      <w:pPr>
+        <w:spacing w:before="100"/>
+        <w:rPr>
+          <w:b/>
+          <w:bCs/>
+          <w:color w:val="1F3864"/>
+          <w:sz w:val="23"/>
+          <w:szCs w:val="23"/>
+        </w:rPr>
+      </w:pPr>
+      <w:r>
+        <w:rPr>
+          <w:b/>
+          <w:bCs/>
+          <w:color w:val="1F3864"/>
+          <w:sz w:val="23"/>
+          <w:szCs w:val="23"/>
+        </w:rPr>
+        <w:t>D.3 SAC Training Configuration File (.</w:t>
+      </w:r>
+      <w:proofErr w:type="spellStart"/>
+      <w:r>
+        <w:rPr>
+          <w:b/>
+          <w:bCs/>
+          <w:color w:val="1F3864"/>
+          <w:sz w:val="23"/>
+          <w:szCs w:val="23"/>
+        </w:rPr>
+        <w:t>yaml</w:t>
+      </w:r>
+      <w:proofErr w:type="spellEnd"/>
+      <w:r>
+        <w:rPr>
+          <w:b/>
+          <w:bCs/>
+          <w:color w:val="1F3864"/>
+          <w:sz w:val="23"/>
+          <w:szCs w:val="23"/>
+        </w:rPr>
+        <w:t>)</w:t>
+      </w:r>
+    </w:p>
+    <w:p>
+      <w:pPr>
+        <w:spacing w:before="100"/>
+        <w:rPr>
+          <w:b/>
+          <w:bCs/>
+          <w:color w:val="1F3864"/>
+          <w:sz w:val="23"/>
+          <w:szCs w:val="23"/>
+        </w:rPr>
+      </w:pPr>
+      <w:r>
+        <w:rPr>
+          <w:b/>
+          <w:bCs/>
+          <w:noProof/>
+          <w:color w:val="1F3864"/>
+          <w:sz w:val="23"/>
+          <w:szCs w:val="23"/>
+        </w:rPr>
+        <w:lastRenderedPageBreak/>
+        <w:drawing>
+          <wp:inline distT="0" distB="0" distL="0" distR="0" wp14:anchorId="6D5C8F65" wp14:editId="353E2F50">
+            <wp:extent cx="5960110" cy="3571240"/>
+            <wp:effectExtent l="0" t="0" r="2540" b="0"/>
+            <wp:docPr id="431640175" name="Picture 3"/>
+            <wp:cNvGraphicFramePr>
+              <a:graphicFrameLocks xmlns:a="http://schemas.openxmlformats.org/drawingml/2006/main" noChangeAspect="1"/>
+            </wp:cNvGraphicFramePr>
+            <a:graphic xmlns:a="http://schemas.openxmlformats.org/drawingml/2006/main">
+              <a:graphicData uri="http://schemas.openxmlformats.org/drawingml/2006/picture">
+                <pic:pic xmlns:pic="http://schemas.openxmlformats.org/drawingml/2006/picture">
+                  <pic:nvPicPr>
+                    <pic:cNvPr id="431640175" name="Picture 431640175"/>
+                    <pic:cNvPicPr/>
+                  </pic:nvPicPr>
+                  <pic:blipFill>
+                    <a:blip r:embed="rId15" cstate="print">
+                      <a:extLst>
+                        <a:ext uri="{28A0092B-C50C-407E-A947-70E740481C1C}">
+                          <a14:useLocalDpi xmlns:a14="http://schemas.microsoft.com/office/drawing/2010/main" val="0"/>
+                        </a:ext>
+                      </a:extLst>
+                    </a:blip>
+                    <a:stretch>
+                      <a:fillRect/>
+                    </a:stretch>
+                  </pic:blipFill>
+                  <pic:spPr>
+                    <a:xfrm>
+                      <a:off x="0" y="0"/>
+                      <a:ext cx="5960110" cy="3571240"/>
+                    </a:xfrm>
+                    <a:prstGeom prst="rect">
+                      <a:avLst/>
+                    </a:prstGeom>
+                  </pic:spPr>
+                </pic:pic>
+              </a:graphicData>
+            </a:graphic>
+          </wp:inline>
+        </w:drawing>
+      </w:r>
+    </w:p>
+    <w:p>
+      <w:pPr>
+        <w:spacing w:before="100"/>
+      </w:pPr>
+    </w:p>
+    <w:p>
+      <w:pPr>
+        <w:pStyle w:val="Heading2"/>
+      </w:pPr>
+      <w:r>
+        <w:t>Appendix E: Git Commit History</w:t>
       </w:r>
     </w:p>
     <w:tbl>
@@ -12672,732 +13151,8 @@
                 <w:sz w:val="21"/>
                 <w:szCs w:val="21"/>
               </w:rPr>
-              <w:t xml:space="preserve">[ INSERT: Screenshot of Unity </w:t>
-            </w:r>
-            <w:proofErr w:type="gramStart"/>
-            <w:r>
-              <w:rPr>
-                <w:b/>
-                <w:bCs/>
-                <w:i/>
-                <w:iCs/>
-                <w:color w:val="2E75B6"/>
-                <w:sz w:val="21"/>
-                <w:szCs w:val="21"/>
-              </w:rPr>
-              <w:t>Editor ]</w:t>
-            </w:r>
-            <w:proofErr w:type="gramEnd"/>
-          </w:p>
-        </w:tc>
-      </w:tr>
-    </w:tbl>
-    <w:p>
-      <w:pPr>
-        <w:spacing w:before="60" w:after="160"/>
-        <w:jc w:val="center"/>
-        <w:rPr>
-          <w:i/>
-          <w:iCs/>
-          <w:color w:val="777777"/>
-          <w:sz w:val="19"/>
-          <w:szCs w:val="19"/>
-        </w:rPr>
-      </w:pPr>
-      <w:r>
-        <w:rPr>
-          <w:i/>
-          <w:iCs/>
-          <w:color w:val="777777"/>
-          <w:sz w:val="19"/>
-          <w:szCs w:val="19"/>
-        </w:rPr>
-        <w:t xml:space="preserve">Figure A1. Training Environment — dynamic arena with randomised obstacle placement and randomised target positions. The Testing </w:t>
-      </w:r>
-      <w:r>
-        <w:rPr>
-          <w:i/>
-          <w:iCs/>
-          <w:color w:val="777777"/>
-          <w:sz w:val="20"/>
-          <w:szCs w:val="20"/>
-        </w:rPr>
-        <w:t>Environm</w:t>
-      </w:r>
-      <w:r>
-        <w:rPr>
-          <w:i/>
-          <w:iCs/>
-          <w:color w:val="777777"/>
-          <w:sz w:val="19"/>
-          <w:szCs w:val="19"/>
-        </w:rPr>
-        <w:t>ent has not yet been constructed at this stage of the project.</w:t>
-      </w:r>
-    </w:p>
-    <w:p>
-      <w:pPr>
-        <w:spacing w:before="60" w:after="160"/>
-      </w:pPr>
-      <w:r>
-        <w:rPr>
-          <w:b/>
-          <w:bCs/>
-        </w:rPr>
-        <w:t xml:space="preserve">Appendix B: </w:t>
-      </w:r>
-    </w:p>
-    <w:p>
-      <w:pPr>
-        <w:spacing w:before="60" w:after="160"/>
-      </w:pPr>
-    </w:p>
-    <w:p>
-      <w:pPr>
-        <w:spacing w:before="100"/>
-      </w:pPr>
-    </w:p>
-    <w:p>
-      <w:pPr>
-        <w:pStyle w:val="Heading2"/>
-      </w:pPr>
-      <w:r>
-        <w:t>Appendix B: SAC Initial Training Output</w:t>
-      </w:r>
-    </w:p>
-    <w:tbl>
-      <w:tblPr>
-        <w:tblW w:w="9026" w:type="dxa"/>
-        <w:tblBorders>
-          <w:top w:val="single" w:sz="4" w:space="0" w:color="auto"/>
-          <w:left w:val="single" w:sz="4" w:space="0" w:color="auto"/>
-          <w:bottom w:val="single" w:sz="4" w:space="0" w:color="auto"/>
-          <w:right w:val="single" w:sz="4" w:space="0" w:color="auto"/>
-          <w:insideH w:val="single" w:sz="4" w:space="0" w:color="auto"/>
-          <w:insideV w:val="single" w:sz="4" w:space="0" w:color="auto"/>
-        </w:tblBorders>
-        <w:tblCellMar>
-          <w:left w:w="10" w:type="dxa"/>
-          <w:right w:w="10" w:type="dxa"/>
-        </w:tblCellMar>
-        <w:tblLook w:val="0000" w:firstRow="0" w:lastRow="0" w:firstColumn="0" w:lastColumn="0" w:noHBand="0" w:noVBand="0"/>
-      </w:tblPr>
-      <w:tblGrid>
-        <w:gridCol w:w="9026"/>
-      </w:tblGrid>
-      <w:tr>
-        <w:tc>
-          <w:tcPr>
-            <w:tcW w:w="0" w:type="auto"/>
-            <w:tcBorders>
-              <w:top w:val="single" w:sz="2" w:space="0" w:color="2E75B6"/>
-              <w:left w:val="single" w:sz="2" w:space="0" w:color="2E75B6"/>
-              <w:bottom w:val="single" w:sz="2" w:space="0" w:color="2E75B6"/>
-              <w:right w:val="single" w:sz="2" w:space="0" w:color="2E75B6"/>
-            </w:tcBorders>
-            <w:shd w:val="clear" w:color="auto" w:fill="EAF0F8"/>
-            <w:tcMar>
-              <w:top w:w="500" w:type="dxa"/>
-              <w:left w:w="400" w:type="dxa"/>
-              <w:bottom w:w="500" w:type="dxa"/>
-              <w:right w:w="400" w:type="dxa"/>
-            </w:tcMar>
-          </w:tcPr>
-          <w:p>
-            <w:pPr>
-              <w:spacing w:before="60" w:after="160"/>
-              <w:rPr>
-                <w:b/>
-                <w:bCs/>
-                <w:color w:val="215E99" w:themeColor="text2" w:themeTint="BF"/>
-              </w:rPr>
-            </w:pPr>
-            <w:r>
-              <w:rPr>
-                <w:b/>
-                <w:bCs/>
-                <w:color w:val="215E99" w:themeColor="text2" w:themeTint="BF"/>
-              </w:rPr>
-              <w:t xml:space="preserve">[ INSERT: Screenshot of Python console output from initial SAC training </w:t>
-            </w:r>
-            <w:proofErr w:type="gramStart"/>
-            <w:r>
-              <w:rPr>
-                <w:b/>
-                <w:bCs/>
-                <w:color w:val="215E99" w:themeColor="text2" w:themeTint="BF"/>
-              </w:rPr>
-              <w:t>runs ]</w:t>
-            </w:r>
-            <w:proofErr w:type="gramEnd"/>
-          </w:p>
-          <w:p>
-            <w:pPr>
-              <w:jc w:val="center"/>
-              <w:rPr>
-                <w:b/>
-                <w:bCs/>
-                <w:color w:val="215E99" w:themeColor="text2" w:themeTint="BF"/>
-              </w:rPr>
-            </w:pPr>
-          </w:p>
-        </w:tc>
-      </w:tr>
-    </w:tbl>
-    <w:p>
-      <w:pPr>
-        <w:spacing w:before="60" w:after="160"/>
-        <w:rPr>
-          <w:color w:val="747474" w:themeColor="background2" w:themeShade="80"/>
-          <w:sz w:val="20"/>
-          <w:szCs w:val="20"/>
-        </w:rPr>
-      </w:pPr>
-      <w:r>
-        <w:rPr>
-          <w:i/>
-          <w:iCs/>
-          <w:color w:val="747474" w:themeColor="background2" w:themeShade="80"/>
-          <w:sz w:val="20"/>
-          <w:szCs w:val="20"/>
-        </w:rPr>
-        <w:t>Figure B1. Python console output confirming successful communication between the Unity Training Environment and the SAC training pipeline. Initial training runs show the agent beginning to learn goal-directed behaviour. Full multi-seed training and TensorBoard analysis are planned for the next phase.</w:t>
-      </w:r>
-    </w:p>
-    <w:p>
-      <w:pPr>
-        <w:spacing w:before="60" w:after="160"/>
-        <w:jc w:val="center"/>
-        <w:rPr>
-          <w:color w:val="747474" w:themeColor="background2" w:themeShade="80"/>
-        </w:rPr>
-      </w:pPr>
-      <w:r>
-        <w:rPr>
-          <w:i/>
-          <w:iCs/>
-          <w:color w:val="747474" w:themeColor="background2" w:themeShade="80"/>
-          <w:sz w:val="19"/>
-          <w:szCs w:val="19"/>
-        </w:rPr>
-        <w:t>.</w:t>
-      </w:r>
-    </w:p>
-    <w:p>
-      <w:pPr>
-        <w:spacing w:before="100"/>
-      </w:pPr>
-    </w:p>
-    <w:p>
-      <w:pPr>
-        <w:pStyle w:val="Heading2"/>
-      </w:pPr>
-      <w:r>
-        <w:t>Appendix C: DQN Q-Network Architecture</w:t>
-      </w:r>
-    </w:p>
-    <w:tbl>
-      <w:tblPr>
-        <w:tblW w:w="9026" w:type="dxa"/>
-        <w:tblBorders>
-          <w:top w:val="single" w:sz="4" w:space="0" w:color="auto"/>
-          <w:left w:val="single" w:sz="4" w:space="0" w:color="auto"/>
-          <w:bottom w:val="single" w:sz="4" w:space="0" w:color="auto"/>
-          <w:right w:val="single" w:sz="4" w:space="0" w:color="auto"/>
-          <w:insideH w:val="single" w:sz="4" w:space="0" w:color="auto"/>
-          <w:insideV w:val="single" w:sz="4" w:space="0" w:color="auto"/>
-        </w:tblBorders>
-        <w:tblCellMar>
-          <w:left w:w="10" w:type="dxa"/>
-          <w:right w:w="10" w:type="dxa"/>
-        </w:tblCellMar>
-        <w:tblLook w:val="0000" w:firstRow="0" w:lastRow="0" w:firstColumn="0" w:lastColumn="0" w:noHBand="0" w:noVBand="0"/>
-      </w:tblPr>
-      <w:tblGrid>
-        <w:gridCol w:w="9026"/>
-      </w:tblGrid>
-      <w:tr>
-        <w:tc>
-          <w:tcPr>
-            <w:tcW w:w="0" w:type="auto"/>
-            <w:tcBorders>
-              <w:top w:val="single" w:sz="2" w:space="0" w:color="2E75B6"/>
-              <w:left w:val="single" w:sz="2" w:space="0" w:color="2E75B6"/>
-              <w:bottom w:val="single" w:sz="2" w:space="0" w:color="2E75B6"/>
-              <w:right w:val="single" w:sz="2" w:space="0" w:color="2E75B6"/>
-            </w:tcBorders>
-            <w:shd w:val="clear" w:color="auto" w:fill="EAF0F8"/>
-            <w:tcMar>
-              <w:top w:w="500" w:type="dxa"/>
-              <w:left w:w="400" w:type="dxa"/>
-              <w:bottom w:w="500" w:type="dxa"/>
-              <w:right w:w="400" w:type="dxa"/>
-            </w:tcMar>
-          </w:tcPr>
-          <w:p>
-            <w:pPr>
-              <w:jc w:val="center"/>
-            </w:pPr>
-            <w:r>
-              <w:rPr>
-                <w:b/>
-                <w:bCs/>
-                <w:i/>
-                <w:iCs/>
-                <w:color w:val="2E75B6"/>
-                <w:sz w:val="21"/>
-                <w:szCs w:val="21"/>
-              </w:rPr>
-              <w:t>[ INSERT: Neural network architecture diagram for DQN Q-network (input, hidden layers, output Q-values</w:t>
-            </w:r>
-            <w:proofErr w:type="gramStart"/>
-            <w:r>
-              <w:rPr>
-                <w:b/>
-                <w:bCs/>
-                <w:i/>
-                <w:iCs/>
-                <w:color w:val="2E75B6"/>
-                <w:sz w:val="21"/>
-                <w:szCs w:val="21"/>
-              </w:rPr>
-              <w:t>) ]</w:t>
-            </w:r>
-            <w:proofErr w:type="gramEnd"/>
-          </w:p>
-        </w:tc>
-      </w:tr>
-    </w:tbl>
-    <w:p>
-      <w:pPr>
-        <w:spacing w:before="60" w:after="160"/>
-        <w:jc w:val="center"/>
-        <w:rPr>
-          <w:i/>
-          <w:iCs/>
-          <w:color w:val="777777"/>
-          <w:sz w:val="19"/>
-          <w:szCs w:val="19"/>
-        </w:rPr>
-      </w:pPr>
-      <w:r>
-        <w:rPr>
-          <w:i/>
-          <w:iCs/>
-          <w:color w:val="777777"/>
-          <w:sz w:val="19"/>
-          <w:szCs w:val="19"/>
-        </w:rPr>
-        <w:t xml:space="preserve">Figure C1. DQN Q-network architecture implemented in PyTorch. Input layer: 14 observations (12 </w:t>
-      </w:r>
-      <w:proofErr w:type="spellStart"/>
-      <w:r>
-        <w:rPr>
-          <w:i/>
-          <w:iCs/>
-          <w:color w:val="777777"/>
-          <w:sz w:val="19"/>
-          <w:szCs w:val="19"/>
-        </w:rPr>
-        <w:t>raycasts</w:t>
-      </w:r>
-      <w:proofErr w:type="spellEnd"/>
-      <w:r>
-        <w:rPr>
-          <w:i/>
-          <w:iCs/>
-          <w:color w:val="777777"/>
-          <w:sz w:val="19"/>
-          <w:szCs w:val="19"/>
-        </w:rPr>
-        <w:t xml:space="preserve">, distance to target, bearing to target). Hidden layers: two fully connected layers of 128 units each with </w:t>
-      </w:r>
-      <w:proofErr w:type="spellStart"/>
-      <w:r>
-        <w:rPr>
-          <w:i/>
-          <w:iCs/>
-          <w:color w:val="777777"/>
-          <w:sz w:val="19"/>
-          <w:szCs w:val="19"/>
-        </w:rPr>
-        <w:t>ReLU</w:t>
-      </w:r>
-      <w:proofErr w:type="spellEnd"/>
-      <w:r>
-        <w:rPr>
-          <w:i/>
-          <w:iCs/>
-          <w:color w:val="777777"/>
-          <w:sz w:val="19"/>
-          <w:szCs w:val="19"/>
-        </w:rPr>
-        <w:t xml:space="preserve"> activation. Output layer: 4 Q-values corresponding to discrete actions.</w:t>
-      </w:r>
-    </w:p>
-    <w:p>
-      <w:pPr>
-        <w:spacing w:before="100"/>
-      </w:pPr>
-    </w:p>
-    <w:p>
-      <w:pPr>
-        <w:pStyle w:val="Heading2"/>
-      </w:pPr>
-      <w:r>
-        <w:t>Appendix D: Code Snippets</w:t>
-      </w:r>
-    </w:p>
-    <w:p>
-      <w:pPr>
-        <w:pStyle w:val="Heading3"/>
-      </w:pPr>
-      <w:r>
-        <w:t>D.1 Reward Function (AgentNavigation.cs)</w:t>
-      </w:r>
-    </w:p>
-    <w:p>
-      <w:pPr>
-        <w:spacing w:before="100"/>
-        <w:rPr>
-          <w:b/>
-          <w:bCs/>
-          <w:color w:val="1F3864"/>
-          <w:sz w:val="23"/>
-          <w:szCs w:val="23"/>
-        </w:rPr>
-      </w:pPr>
-      <w:r>
-        <w:rPr>
-          <w:b/>
-          <w:bCs/>
-          <w:color w:val="1F3864"/>
-          <w:sz w:val="23"/>
-          <w:szCs w:val="23"/>
-        </w:rPr>
-        <w:t>[ INSERT: Code snippet of the reward function in C# showing distance-shaping reward, goal-reached bonus, collision penalty, and time penalty</w:t>
-      </w:r>
-      <w:proofErr w:type="gramStart"/>
-      <w:r>
-        <w:rPr>
-          <w:b/>
-          <w:bCs/>
-          <w:color w:val="1F3864"/>
-          <w:sz w:val="23"/>
-          <w:szCs w:val="23"/>
-        </w:rPr>
-        <w:t>. ]</w:t>
-      </w:r>
-      <w:proofErr w:type="gramEnd"/>
-    </w:p>
-    <w:p>
-      <w:pPr>
-        <w:spacing w:before="100"/>
-        <w:rPr>
-          <w:b/>
-          <w:bCs/>
-          <w:color w:val="1F3864"/>
-          <w:sz w:val="23"/>
-          <w:szCs w:val="23"/>
-        </w:rPr>
-      </w:pPr>
-      <w:r>
-        <w:rPr>
-          <w:b/>
-          <w:bCs/>
-          <w:color w:val="1F3864"/>
-          <w:sz w:val="23"/>
-          <w:szCs w:val="23"/>
-        </w:rPr>
-        <w:t>D.2 DQN Q-Network Class (Python / PyTorch)</w:t>
-      </w:r>
-    </w:p>
-    <w:p>
-      <w:pPr>
-        <w:spacing w:before="100"/>
-        <w:rPr>
-          <w:b/>
-          <w:bCs/>
-          <w:color w:val="1F3864"/>
-          <w:sz w:val="23"/>
-          <w:szCs w:val="23"/>
-        </w:rPr>
-      </w:pPr>
-      <w:r>
-        <w:rPr>
-          <w:b/>
-          <w:bCs/>
-          <w:color w:val="1F3864"/>
-          <w:sz w:val="23"/>
-          <w:szCs w:val="23"/>
-        </w:rPr>
-        <w:lastRenderedPageBreak/>
-        <w:t xml:space="preserve">[ INSERT: Code snippet of the PyTorch </w:t>
-      </w:r>
-      <w:proofErr w:type="spellStart"/>
-      <w:r>
-        <w:rPr>
-          <w:b/>
-          <w:bCs/>
-          <w:color w:val="1F3864"/>
-          <w:sz w:val="23"/>
-          <w:szCs w:val="23"/>
-        </w:rPr>
-        <w:t>QNetwork</w:t>
-      </w:r>
-      <w:proofErr w:type="spellEnd"/>
-      <w:r>
-        <w:rPr>
-          <w:b/>
-          <w:bCs/>
-          <w:color w:val="1F3864"/>
-          <w:sz w:val="23"/>
-          <w:szCs w:val="23"/>
-        </w:rPr>
-        <w:t xml:space="preserve"> class showing the __</w:t>
-      </w:r>
-      <w:proofErr w:type="spellStart"/>
-      <w:r>
-        <w:rPr>
-          <w:b/>
-          <w:bCs/>
-          <w:color w:val="1F3864"/>
-          <w:sz w:val="23"/>
-          <w:szCs w:val="23"/>
-        </w:rPr>
-        <w:t>init</w:t>
-      </w:r>
-      <w:proofErr w:type="spellEnd"/>
-      <w:r>
-        <w:rPr>
-          <w:b/>
-          <w:bCs/>
-          <w:color w:val="1F3864"/>
-          <w:sz w:val="23"/>
-          <w:szCs w:val="23"/>
-        </w:rPr>
-        <w:t>__ method and forward pass</w:t>
-      </w:r>
-      <w:proofErr w:type="gramStart"/>
-      <w:r>
-        <w:rPr>
-          <w:b/>
-          <w:bCs/>
-          <w:color w:val="1F3864"/>
-          <w:sz w:val="23"/>
-          <w:szCs w:val="23"/>
-        </w:rPr>
-        <w:t>. ]</w:t>
-      </w:r>
-      <w:proofErr w:type="gramEnd"/>
-    </w:p>
-    <w:p>
-      <w:pPr>
-        <w:spacing w:before="100"/>
-        <w:rPr>
-          <w:b/>
-          <w:bCs/>
-          <w:color w:val="1F3864"/>
-          <w:sz w:val="23"/>
-          <w:szCs w:val="23"/>
-        </w:rPr>
-      </w:pPr>
-    </w:p>
-    <w:p>
-      <w:pPr>
-        <w:spacing w:before="100"/>
-        <w:rPr>
-          <w:b/>
-          <w:bCs/>
-          <w:color w:val="1F3864"/>
-          <w:sz w:val="23"/>
-          <w:szCs w:val="23"/>
-        </w:rPr>
-      </w:pPr>
-    </w:p>
-    <w:p>
-      <w:pPr>
-        <w:spacing w:before="100"/>
-        <w:rPr>
-          <w:b/>
-          <w:bCs/>
-          <w:color w:val="1F3864"/>
-          <w:sz w:val="23"/>
-          <w:szCs w:val="23"/>
-        </w:rPr>
-      </w:pPr>
-    </w:p>
-    <w:p>
-      <w:pPr>
-        <w:spacing w:before="100"/>
-        <w:rPr>
-          <w:b/>
-          <w:bCs/>
-          <w:color w:val="1F3864"/>
-          <w:sz w:val="23"/>
-          <w:szCs w:val="23"/>
-        </w:rPr>
-      </w:pPr>
-      <w:r>
-        <w:rPr>
-          <w:b/>
-          <w:bCs/>
-          <w:color w:val="1F3864"/>
-          <w:sz w:val="23"/>
-          <w:szCs w:val="23"/>
-        </w:rPr>
-        <w:t>D.3 SAC Training Configuration File (.</w:t>
-      </w:r>
-      <w:proofErr w:type="spellStart"/>
-      <w:r>
-        <w:rPr>
-          <w:b/>
-          <w:bCs/>
-          <w:color w:val="1F3864"/>
-          <w:sz w:val="23"/>
-          <w:szCs w:val="23"/>
-        </w:rPr>
-        <w:t>yaml</w:t>
-      </w:r>
-      <w:proofErr w:type="spellEnd"/>
-      <w:r>
-        <w:rPr>
-          <w:b/>
-          <w:bCs/>
-          <w:color w:val="1F3864"/>
-          <w:sz w:val="23"/>
-          <w:szCs w:val="23"/>
-        </w:rPr>
-        <w:t>)</w:t>
-      </w:r>
-    </w:p>
-    <w:p>
-      <w:pPr>
-        <w:spacing w:before="100"/>
-        <w:rPr>
-          <w:b/>
-          <w:bCs/>
-          <w:color w:val="1F3864"/>
-          <w:sz w:val="23"/>
-          <w:szCs w:val="23"/>
-        </w:rPr>
-      </w:pPr>
-      <w:r>
-        <w:rPr>
-          <w:b/>
-          <w:bCs/>
-          <w:color w:val="1F3864"/>
-          <w:sz w:val="23"/>
-          <w:szCs w:val="23"/>
-        </w:rPr>
-        <w:t>[ INSERT: SAC hyperparameter configuration file showing learning rate, buffer size, batch size, and entropy settings</w:t>
-      </w:r>
-      <w:proofErr w:type="gramStart"/>
-      <w:r>
-        <w:rPr>
-          <w:b/>
-          <w:bCs/>
-          <w:color w:val="1F3864"/>
-          <w:sz w:val="23"/>
-          <w:szCs w:val="23"/>
-        </w:rPr>
-        <w:t>. ]</w:t>
-      </w:r>
-      <w:proofErr w:type="gramEnd"/>
-    </w:p>
-    <w:p>
-      <w:pPr>
-        <w:spacing w:before="100"/>
-        <w:rPr>
-          <w:b/>
-          <w:bCs/>
-          <w:color w:val="1F3864"/>
-          <w:sz w:val="23"/>
-          <w:szCs w:val="23"/>
-        </w:rPr>
-      </w:pPr>
-    </w:p>
-    <w:p>
-      <w:pPr>
-        <w:spacing w:before="100"/>
-      </w:pPr>
-    </w:p>
-    <w:p>
-      <w:pPr>
-        <w:pStyle w:val="Heading2"/>
-      </w:pPr>
-      <w:r>
-        <w:t>Appendix E: Git Commit History</w:t>
-      </w:r>
-    </w:p>
-    <w:tbl>
-      <w:tblPr>
-        <w:tblW w:w="9026" w:type="dxa"/>
-        <w:tblBorders>
-          <w:top w:val="single" w:sz="4" w:space="0" w:color="auto"/>
-          <w:left w:val="single" w:sz="4" w:space="0" w:color="auto"/>
-          <w:bottom w:val="single" w:sz="4" w:space="0" w:color="auto"/>
-          <w:right w:val="single" w:sz="4" w:space="0" w:color="auto"/>
-          <w:insideH w:val="single" w:sz="4" w:space="0" w:color="auto"/>
-          <w:insideV w:val="single" w:sz="4" w:space="0" w:color="auto"/>
-        </w:tblBorders>
-        <w:tblCellMar>
-          <w:left w:w="10" w:type="dxa"/>
-          <w:right w:w="10" w:type="dxa"/>
-        </w:tblCellMar>
-        <w:tblLook w:val="0000" w:firstRow="0" w:lastRow="0" w:firstColumn="0" w:lastColumn="0" w:noHBand="0" w:noVBand="0"/>
-      </w:tblPr>
-      <w:tblGrid>
-        <w:gridCol w:w="9026"/>
-      </w:tblGrid>
-      <w:tr>
-        <w:tc>
-          <w:tcPr>
-            <w:tcW w:w="0" w:type="auto"/>
-            <w:tcBorders>
-              <w:top w:val="single" w:sz="2" w:space="0" w:color="2E75B6"/>
-              <w:left w:val="single" w:sz="2" w:space="0" w:color="2E75B6"/>
-              <w:bottom w:val="single" w:sz="2" w:space="0" w:color="2E75B6"/>
-              <w:right w:val="single" w:sz="2" w:space="0" w:color="2E75B6"/>
-            </w:tcBorders>
-            <w:shd w:val="clear" w:color="auto" w:fill="EAF0F8"/>
-            <w:tcMar>
-              <w:top w:w="500" w:type="dxa"/>
-              <w:left w:w="400" w:type="dxa"/>
-              <w:bottom w:w="500" w:type="dxa"/>
-              <w:right w:w="400" w:type="dxa"/>
-            </w:tcMar>
-          </w:tcPr>
-          <w:p>
-            <w:pPr>
-              <w:jc w:val="center"/>
-            </w:pPr>
-            <w:r>
-              <w:rPr>
-                <w:b/>
-                <w:bCs/>
-                <w:i/>
-                <w:iCs/>
-                <w:color w:val="2E75B6"/>
-                <w:sz w:val="21"/>
-                <w:szCs w:val="21"/>
-              </w:rPr>
-              <w:t xml:space="preserve">[ INSERT: Screenshot of GitHub repository commit history showing iterative development with descriptive commit </w:t>
-            </w:r>
-            <w:proofErr w:type="gramStart"/>
-            <w:r>
-              <w:rPr>
-                <w:b/>
-                <w:bCs/>
-                <w:i/>
-                <w:iCs/>
-                <w:color w:val="2E75B6"/>
-                <w:sz w:val="21"/>
-                <w:szCs w:val="21"/>
-              </w:rPr>
-              <w:t>messages ]</w:t>
-            </w:r>
-            <w:proofErr w:type="gramEnd"/>
+              <w:t>[ INSERT: Screenshot of GitHub repository commit history showing iterative development with descriptive commit messages ]</w:t>
+            </w:r>
           </w:p>
         </w:tc>
       </w:tr>
@@ -13423,8 +13178,8 @@
       </w:r>
     </w:p>
     <w:sectPr>
-      <w:headerReference w:type="default" r:id="rId13"/>
-      <w:footerReference w:type="default" r:id="rId14"/>
+      <w:headerReference w:type="default" r:id="rId16"/>
+      <w:footerReference w:type="default" r:id="rId17"/>
       <w:pgSz w:w="11906" w:h="16838"/>
       <w:pgMar w:top="1440" w:right="1260" w:bottom="1440" w:left="1260" w:header="708" w:footer="708" w:gutter="0"/>
       <w:cols w:space="720"/>
@@ -15107,14 +14862,17 @@
     <w:rsidRoot w:val="00850A12"/>
     <w:rsid w:val="002F6C15"/>
     <w:rsid w:val="0037025C"/>
+    <w:rsid w:val="004853C9"/>
     <w:rsid w:val="004E5B80"/>
     <w:rsid w:val="00536504"/>
+    <w:rsid w:val="005E4781"/>
     <w:rsid w:val="00850A12"/>
     <w:rsid w:val="00883521"/>
     <w:rsid w:val="00A84F4C"/>
     <w:rsid w:val="00D53533"/>
     <w:rsid w:val="00D71BF2"/>
     <w:rsid w:val="00EF0364"/>
+    <w:rsid w:val="00F27BA3"/>
   </w:rsids>
   <m:mathPr>
     <m:mathFont m:val="Cambria Math"/>

</xml_diff>

<commit_message>
CODE added in docs with photos of env
</commit_message>
<xml_diff>
--- a/IPR_Rana_Zeeshan_Ali_24000292.docx
+++ b/IPR_Rana_Zeeshan_Ali_24000292.docx
@@ -38,7 +38,25 @@
           <w:sz w:val="23"/>
           <w:szCs w:val="23"/>
         </w:rPr>
-        <w:t>MSc Advanced Computer Science  |  7COM1039-0206-2025</w:t>
+        <w:t xml:space="preserve">MSc Advanced Computer </w:t>
+      </w:r>
+      <w:proofErr w:type="gramStart"/>
+      <w:r>
+        <w:rPr>
+          <w:color w:val="2E75B6"/>
+          <w:sz w:val="23"/>
+          <w:szCs w:val="23"/>
+        </w:rPr>
+        <w:t>Science  |</w:t>
+      </w:r>
+      <w:proofErr w:type="gramEnd"/>
+      <w:r>
+        <w:rPr>
+          <w:color w:val="2E75B6"/>
+          <w:sz w:val="23"/>
+          <w:szCs w:val="23"/>
+        </w:rPr>
+        <w:t xml:space="preserve">  7COM1039-0206-2025</w:t>
       </w:r>
     </w:p>
     <w:p>
@@ -1911,7 +1929,15 @@
           </w:tcPr>
           <w:p>
             <w:r>
-              <w:t>SAC hyperparameter configuration file for Unity ML-Agents trainer</w:t>
+              <w:t>SAC hyperparameter configuration file for Unity ML-</w:t>
+            </w:r>
+            <w:proofErr w:type="gramStart"/>
+            <w:r>
+              <w:t>Agents</w:t>
+            </w:r>
+            <w:proofErr w:type="gramEnd"/>
+            <w:r>
+              <w:t xml:space="preserve"> trainer</w:t>
             </w:r>
           </w:p>
         </w:tc>
@@ -2009,7 +2035,15 @@
           </w:tcPr>
           <w:p>
             <w:r>
-              <w:t>PPO hyperparameter configuration file for Unity ML-Agents trainer</w:t>
+              <w:t>PPO hyperparameter configuration file for Unity ML-</w:t>
+            </w:r>
+            <w:proofErr w:type="gramStart"/>
+            <w:r>
+              <w:t>Agents</w:t>
+            </w:r>
+            <w:proofErr w:type="gramEnd"/>
+            <w:r>
+              <w:t xml:space="preserve"> trainer</w:t>
             </w:r>
           </w:p>
         </w:tc>
@@ -4088,7 +4122,15 @@
     </w:p>
     <w:p>
       <w:r>
-        <w:t>A further social concern is the potential for reinforcement learning policies to perform poorly or unsafely when deployed in real-world environments that differ from training conditions. This project mitigates that risk within its current scope through environment randomisation, the structural separation of Training and Testing Environments, and multi-seed validation across five independent runs. The Testing Environment in particular serves a direct social function: it provides empirical evidence about whether each algorithm's learned behaviour transfers beyond its training context, which is the most practically relevant question for any system intended for real-world deployment. However, the broader sim-to-real transfer problem remains an open challenge in the research community.</w:t>
+        <w:t xml:space="preserve">A further social concern is the potential for reinforcement learning policies to perform poorly or unsafely when deployed in real-world environments that differ from training conditions. This project mitigates that risk within its current scope through environment randomisation, the structural separation of Training and Testing Environments, and multi-seed validation across five independent runs. The Testing Environment </w:t>
+      </w:r>
+      <w:proofErr w:type="gramStart"/>
+      <w:r>
+        <w:t>in particular serves</w:t>
+      </w:r>
+      <w:proofErr w:type="gramEnd"/>
+      <w:r>
+        <w:t xml:space="preserve"> a direct social function: it provides empirical evidence about whether each algorithm's learned behaviour transfers beyond its training context, which is the most practically relevant question for any system intended for real-world deployment. However, the broader sim-to-real transfer problem remains an open challenge in the research community.</w:t>
       </w:r>
     </w:p>
     <w:p>
@@ -4164,7 +4206,15 @@
         <w:jc w:val="both"/>
       </w:pPr>
       <w:r>
-        <w:t>The structural separation between the Training Environment and the Testing Environment also introduces a one-directional data flow discipline into the project management approach. Algorithm configuration and hyperparameter decisions are made on the basis of Training Environment results only; the Testing Environment is held in reserve until all training is complete, ensuring that no information from the Testing Environment influences training decisions. This prevents inadvertent optimisation toward the test conditions and is enforced as a project management constraint as well as a methodological one. In practice, this means the Testing Environment Unity scene file will not be constructed until all five seeds per algorithm have completed training, all hyperparameter decisions have been locked, and no further modifications to the reward function or agent configuration are made. This sequencing will be documented explicitly in the final report so that the generalisation claim can be independently verified.</w:t>
+        <w:t xml:space="preserve">The structural separation between the Training Environment and the Testing Environment also introduces a one-directional data flow discipline into the project management approach. Algorithm configuration and hyperparameter decisions are made </w:t>
+      </w:r>
+      <w:proofErr w:type="gramStart"/>
+      <w:r>
+        <w:t>on the basis of</w:t>
+      </w:r>
+      <w:proofErr w:type="gramEnd"/>
+      <w:r>
+        <w:t xml:space="preserve"> Training Environment results only; the Testing Environment is held in reserve until all training is complete, ensuring that no information from the Testing Environment influences training decisions. This prevents inadvertent optimisation toward the test conditions and is enforced as a project management constraint as well as a methodological one. In practice, this means the Testing Environment Unity scene file will not be constructed until all five seeds per algorithm have completed training, all hyperparameter decisions have been locked, and no further modifications to the reward function or agent configuration are made. This sequencing will be documented explicitly in the final report so that the generalisation claim can be independently verified.</w:t>
       </w:r>
     </w:p>
     <w:p>
@@ -4678,7 +4728,23 @@
                 <w:sz w:val="20"/>
                 <w:szCs w:val="20"/>
               </w:rPr>
-              <w:t xml:space="preserve">Training time per seed estimated at 4–8 hours depending on algorithm; 15 total runs scheduled sequentially. Compute time will be benchmarked during Week 1 SAC runs; if training exceeds budget, the training step limit will be reduced with a transparent justification, or runs will be </w:t>
+              <w:t xml:space="preserve">Training time per seed estimated at 4–8 hours depending on algorithm; 15 total runs scheduled sequentially. Compute time will be benchmarked during Week 1 SAC runs; if training exceeds budget, the training step limit will be reduced with a transparent </w:t>
+            </w:r>
+            <w:proofErr w:type="gramStart"/>
+            <w:r>
+              <w:rPr>
+                <w:sz w:val="20"/>
+                <w:szCs w:val="20"/>
+              </w:rPr>
+              <w:t>justification, or</w:t>
+            </w:r>
+            <w:proofErr w:type="gramEnd"/>
+            <w:r>
+              <w:rPr>
+                <w:sz w:val="20"/>
+                <w:szCs w:val="20"/>
+              </w:rPr>
+              <w:t xml:space="preserve"> runs will be </w:t>
             </w:r>
             <w:r>
               <w:rPr>
@@ -5078,7 +5144,15 @@
         <w:jc w:val="both"/>
       </w:pPr>
       <w:r>
-        <w:t>Process quality is maintained through disciplined version control, documented hyperparameter choices, reproducible random seed management, and consistent use of the same evaluation scripts across all algorithm runs in both environments. Before each algorithm’s training begins, a pre-run consistency checklist is completed to verify that the reward function parameters, episode length limits, training budget (measured in environment steps rather than episodes, to account for differences in episode duration across algorithms), and environment random seed configuration are identical across SAC, PPO, and DQN. Each training run is validated by checking that TensorBoard curves show the expected learning progression before results are accepted as valid data points for statistical analysis. The Testing Environment is kept strictly isolated from all training decisions until the training phase is complete.</w:t>
+        <w:t xml:space="preserve">Process quality is maintained through disciplined version control, documented hyperparameter choices, reproducible random seed management, and consistent use of the same evaluation scripts across all </w:t>
+      </w:r>
+      <w:proofErr w:type="gramStart"/>
+      <w:r>
+        <w:t>algorithm</w:t>
+      </w:r>
+      <w:proofErr w:type="gramEnd"/>
+      <w:r>
+        <w:t xml:space="preserve"> runs in both environments. Before each algorithm’s training begins, a pre-run consistency checklist is completed to verify that the reward function parameters, episode length limits, training budget (measured in environment steps rather than episodes, to account for differences in episode duration across algorithms), and environment random seed configuration are identical across SAC, PPO, and DQN. Each training run is validated by checking that TensorBoard curves show the expected learning progression before results are accepted as valid data points for statistical analysis. The Testing Environment is kept strictly isolated from all training decisions until the training phase is complete.</w:t>
       </w:r>
     </w:p>
     <w:p>
@@ -5897,7 +5971,23 @@
                 <w:sz w:val="20"/>
                 <w:szCs w:val="20"/>
               </w:rPr>
-              <w:t>All three algorithm training complete (Weeks 1-3)</w:t>
+              <w:t xml:space="preserve">All </w:t>
+            </w:r>
+            <w:proofErr w:type="gramStart"/>
+            <w:r>
+              <w:rPr>
+                <w:sz w:val="20"/>
+                <w:szCs w:val="20"/>
+              </w:rPr>
+              <w:t>three algorithm</w:t>
+            </w:r>
+            <w:proofErr w:type="gramEnd"/>
+            <w:r>
+              <w:rPr>
+                <w:sz w:val="20"/>
+                <w:szCs w:val="20"/>
+              </w:rPr>
+              <w:t xml:space="preserve"> training complete (Weeks 1-3)</w:t>
             </w:r>
           </w:p>
         </w:tc>
@@ -9890,7 +9980,15 @@
     </w:p>
     <w:p>
       <w:r>
-        <w:t>The table below documents which tasks are dependent on the completion of earlier tasks, and explains why each dependency exists. No task should begin until its predecessor is fully complete and its outputs verified.</w:t>
+        <w:t xml:space="preserve">The table below documents which tasks are dependent on the completion of earlier </w:t>
+      </w:r>
+      <w:proofErr w:type="gramStart"/>
+      <w:r>
+        <w:t>tasks, and</w:t>
+      </w:r>
+      <w:proofErr w:type="gramEnd"/>
+      <w:r>
+        <w:t xml:space="preserve"> explains why each dependency exists. No task should begin until its predecessor is fully complete and its outputs verified.</w:t>
       </w:r>
     </w:p>
     <w:p>
@@ -10102,7 +10200,23 @@
                 <w:sz w:val="20"/>
                 <w:szCs w:val="20"/>
               </w:rPr>
-              <w:t>Training is scheduled sequentially to avoid Unity ML-Agents memory conflicts.</w:t>
+              <w:t>Training is scheduled sequentially to avoid Unity ML-</w:t>
+            </w:r>
+            <w:proofErr w:type="gramStart"/>
+            <w:r>
+              <w:rPr>
+                <w:sz w:val="20"/>
+                <w:szCs w:val="20"/>
+              </w:rPr>
+              <w:t>Agents</w:t>
+            </w:r>
+            <w:proofErr w:type="gramEnd"/>
+            <w:r>
+              <w:rPr>
+                <w:sz w:val="20"/>
+                <w:szCs w:val="20"/>
+              </w:rPr>
+              <w:t xml:space="preserve"> memory conflicts.</w:t>
             </w:r>
           </w:p>
         </w:tc>
@@ -10241,7 +10355,23 @@
                 <w:sz w:val="20"/>
                 <w:szCs w:val="20"/>
               </w:rPr>
-              <w:t>All three algorithm training complete</w:t>
+              <w:t xml:space="preserve">All </w:t>
+            </w:r>
+            <w:proofErr w:type="gramStart"/>
+            <w:r>
+              <w:rPr>
+                <w:sz w:val="20"/>
+                <w:szCs w:val="20"/>
+              </w:rPr>
+              <w:t>three algorithm</w:t>
+            </w:r>
+            <w:proofErr w:type="gramEnd"/>
+            <w:r>
+              <w:rPr>
+                <w:sz w:val="20"/>
+                <w:szCs w:val="20"/>
+              </w:rPr>
+              <w:t xml:space="preserve"> training complete</w:t>
             </w:r>
           </w:p>
         </w:tc>
@@ -12264,7 +12394,15 @@
         <w:t xml:space="preserve"> </w:t>
       </w:r>
       <w:r>
-        <w:t>is what allows the final results to be interpreted with confidence rather than treated as incidental observations.</w:t>
+        <w:t xml:space="preserve">is what allows the </w:t>
+      </w:r>
+      <w:proofErr w:type="gramStart"/>
+      <w:r>
+        <w:t>final results</w:t>
+      </w:r>
+      <w:proofErr w:type="gramEnd"/>
+      <w:r>
+        <w:t xml:space="preserve"> to be interpreted with confidence rather than treated as incidental observations.</w:t>
       </w:r>
     </w:p>
     <w:p>
@@ -12696,18 +12834,6 @@
       <w:pPr>
         <w:spacing w:before="60" w:after="160"/>
       </w:pPr>
-      <w:r>
-        <w:rPr>
-          <w:b/>
-          <w:bCs/>
-        </w:rPr>
-        <w:t xml:space="preserve">Appendix B: </w:t>
-      </w:r>
-    </w:p>
-    <w:p>
-      <w:pPr>
-        <w:spacing w:before="60" w:after="160"/>
-      </w:pPr>
     </w:p>
     <w:p>
       <w:pPr>
@@ -12720,6 +12846,58 @@
       </w:pPr>
       <w:r>
         <w:t>Appendix B: SAC Initial Training Output</w:t>
+      </w:r>
+    </w:p>
+    <w:p>
+      <w:pPr>
+        <w:pStyle w:val="Heading2"/>
+      </w:pPr>
+      <w:r>
+        <w:rPr>
+          <w:noProof/>
+        </w:rPr>
+        <w:lastRenderedPageBreak/>
+        <w:drawing>
+          <wp:inline distT="0" distB="0" distL="0" distR="0" wp14:anchorId="5970CB9E" wp14:editId="36CF3E39">
+            <wp:extent cx="5297664" cy="3539490"/>
+            <wp:effectExtent l="0" t="0" r="0" b="3810"/>
+            <wp:docPr id="1310967080" name="Picture 4"/>
+            <wp:cNvGraphicFramePr>
+              <a:graphicFrameLocks xmlns:a="http://schemas.openxmlformats.org/drawingml/2006/main" noChangeAspect="1"/>
+            </wp:cNvGraphicFramePr>
+            <a:graphic xmlns:a="http://schemas.openxmlformats.org/drawingml/2006/main">
+              <a:graphicData uri="http://schemas.openxmlformats.org/drawingml/2006/picture">
+                <pic:pic xmlns:pic="http://schemas.openxmlformats.org/drawingml/2006/picture">
+                  <pic:nvPicPr>
+                    <pic:cNvPr id="1310967080" name="Picture 1310967080"/>
+                    <pic:cNvPicPr/>
+                  </pic:nvPicPr>
+                  <pic:blipFill>
+                    <a:blip r:embed="rId14" cstate="print">
+                      <a:extLst>
+                        <a:ext uri="{28A0092B-C50C-407E-A947-70E740481C1C}">
+                          <a14:useLocalDpi xmlns:a14="http://schemas.microsoft.com/office/drawing/2010/main" val="0"/>
+                        </a:ext>
+                      </a:extLst>
+                    </a:blip>
+                    <a:stretch>
+                      <a:fillRect/>
+                    </a:stretch>
+                  </pic:blipFill>
+                  <pic:spPr>
+                    <a:xfrm>
+                      <a:off x="0" y="0"/>
+                      <a:ext cx="5301074" cy="3541769"/>
+                    </a:xfrm>
+                    <a:prstGeom prst="rect">
+                      <a:avLst/>
+                    </a:prstGeom>
+                  </pic:spPr>
+                </pic:pic>
+              </a:graphicData>
+            </a:graphic>
+          </wp:inline>
+        </w:drawing>
       </w:r>
     </w:p>
     <w:p>
@@ -12739,7 +12917,7 @@
           <w:sz w:val="20"/>
           <w:szCs w:val="20"/>
         </w:rPr>
-        <w:t>Figure B1. Python console output confirming successful communication between the Unity Training Environment and the SAC training pipeline. Initial training runs show the agent beginning to learn goal-directed behaviour. Full multi-seed training and TensorBoard analysis are planned for the next phase.</w:t>
+        <w:t xml:space="preserve">Figure B. Python console output confirming successful communication between the Unity Training Environment and the SAC training pipeline. Initial training runs show the agent beginning to learn goal-directed behaviour. </w:t>
       </w:r>
     </w:p>
     <w:p>
@@ -12800,7 +12978,6 @@
         <w:rPr>
           <w:noProof/>
         </w:rPr>
-        <w:lastRenderedPageBreak/>
         <w:drawing>
           <wp:inline distT="0" distB="0" distL="0" distR="0" wp14:anchorId="1E4F4F18" wp14:editId="639A1299">
             <wp:extent cx="4785360" cy="2793396"/>
@@ -12817,7 +12994,7 @@
                     <pic:cNvPicPr/>
                   </pic:nvPicPr>
                   <pic:blipFill>
-                    <a:blip r:embed="rId14" cstate="print">
+                    <a:blip r:embed="rId15" cstate="print">
                       <a:extLst>
                         <a:ext uri="{28A0092B-C50C-407E-A947-70E740481C1C}">
                           <a14:useLocalDpi xmlns:a14="http://schemas.microsoft.com/office/drawing/2010/main" val="0"/>
@@ -12864,6 +13041,7 @@
           <w:sz w:val="19"/>
           <w:szCs w:val="19"/>
         </w:rPr>
+        <w:lastRenderedPageBreak/>
         <w:t xml:space="preserve">Figure C1. DQN Q-network architecture implemented in PyTorch. Input layer: 14 observations (12 </w:t>
       </w:r>
       <w:proofErr w:type="spellStart"/>
@@ -12926,14 +13104,6 @@
     </w:p>
     <w:p>
       <w:pPr>
-        <w:pStyle w:val="Heading3"/>
-      </w:pPr>
-      <w:r>
-        <w:t>D.1 Reward Function (AgentNavigation.cs)</w:t>
-      </w:r>
-    </w:p>
-    <w:p>
-      <w:pPr>
         <w:spacing w:before="100"/>
         <w:rPr>
           <w:b/>
@@ -12941,17 +13111,2162 @@
           <w:color w:val="1F3864"/>
           <w:sz w:val="23"/>
           <w:szCs w:val="23"/>
-        </w:rPr>
-      </w:pPr>
-      <w:r>
+          <w:lang w:val="en-PK"/>
+        </w:rPr>
+      </w:pPr>
+    </w:p>
+    <w:p>
+      <w:pPr>
+        <w:spacing w:before="100"/>
         <w:rPr>
           <w:b/>
           <w:bCs/>
           <w:color w:val="1F3864"/>
           <w:sz w:val="23"/>
           <w:szCs w:val="23"/>
-        </w:rPr>
-        <w:t>[ INSERT: Code snippet of the reward function in C# showing distance-shaping reward, goal-reached bonus, collision penalty, and time penalty. ]</w:t>
+          <w:highlight w:val="lightGray"/>
+          <w:lang w:val="en-PK"/>
+        </w:rPr>
+      </w:pPr>
+      <w:r>
+        <w:rPr>
+          <w:b/>
+          <w:bCs/>
+          <w:color w:val="1F3864"/>
+          <w:sz w:val="23"/>
+          <w:szCs w:val="23"/>
+          <w:lang w:val="en-PK"/>
+        </w:rPr>
+        <w:t> </w:t>
+      </w:r>
+      <w:r>
+        <w:rPr>
+          <w:b/>
+          <w:bCs/>
+          <w:color w:val="1F3864"/>
+          <w:sz w:val="23"/>
+          <w:szCs w:val="23"/>
+          <w:highlight w:val="lightGray"/>
+          <w:lang w:val="en-PK"/>
+        </w:rPr>
+        <w:t xml:space="preserve">private void </w:t>
+      </w:r>
+      <w:proofErr w:type="spellStart"/>
+      <w:proofErr w:type="gramStart"/>
+      <w:r>
+        <w:rPr>
+          <w:b/>
+          <w:bCs/>
+          <w:color w:val="1F3864"/>
+          <w:sz w:val="23"/>
+          <w:szCs w:val="23"/>
+          <w:highlight w:val="lightGray"/>
+          <w:lang w:val="en-PK"/>
+        </w:rPr>
+        <w:t>OnTriggerEnter</w:t>
+      </w:r>
+      <w:proofErr w:type="spellEnd"/>
+      <w:r>
+        <w:rPr>
+          <w:b/>
+          <w:bCs/>
+          <w:color w:val="1F3864"/>
+          <w:sz w:val="23"/>
+          <w:szCs w:val="23"/>
+          <w:highlight w:val="lightGray"/>
+          <w:lang w:val="en-PK"/>
+        </w:rPr>
+        <w:t>(</w:t>
+      </w:r>
+      <w:proofErr w:type="gramEnd"/>
+      <w:r>
+        <w:rPr>
+          <w:b/>
+          <w:bCs/>
+          <w:color w:val="1F3864"/>
+          <w:sz w:val="23"/>
+          <w:szCs w:val="23"/>
+          <w:highlight w:val="lightGray"/>
+          <w:lang w:val="en-PK"/>
+        </w:rPr>
+        <w:t>Collider other)</w:t>
+      </w:r>
+    </w:p>
+    <w:p>
+      <w:pPr>
+        <w:spacing w:before="100"/>
+        <w:rPr>
+          <w:rFonts w:ascii="Calibri" w:hAnsi="Calibri" w:cs="Calibri"/>
+          <w:b/>
+          <w:bCs/>
+          <w:i/>
+          <w:iCs/>
+          <w:color w:val="1F3864"/>
+          <w:sz w:val="16"/>
+          <w:szCs w:val="16"/>
+          <w:highlight w:val="lightGray"/>
+          <w:lang w:val="en-PK"/>
+        </w:rPr>
+      </w:pPr>
+      <w:r>
+        <w:rPr>
+          <w:rFonts w:ascii="Calibri" w:hAnsi="Calibri" w:cs="Calibri"/>
+          <w:b/>
+          <w:bCs/>
+          <w:i/>
+          <w:iCs/>
+          <w:color w:val="1F3864"/>
+          <w:sz w:val="16"/>
+          <w:szCs w:val="16"/>
+          <w:highlight w:val="lightGray"/>
+          <w:lang w:val="en-PK"/>
+        </w:rPr>
+        <w:t>    {</w:t>
+      </w:r>
+    </w:p>
+    <w:p>
+      <w:pPr>
+        <w:spacing w:before="100"/>
+        <w:rPr>
+          <w:rFonts w:ascii="Calibri" w:hAnsi="Calibri" w:cs="Calibri"/>
+          <w:b/>
+          <w:bCs/>
+          <w:i/>
+          <w:iCs/>
+          <w:color w:val="1F3864"/>
+          <w:sz w:val="16"/>
+          <w:szCs w:val="16"/>
+          <w:highlight w:val="lightGray"/>
+          <w:lang w:val="en-PK"/>
+        </w:rPr>
+      </w:pPr>
+      <w:r>
+        <w:rPr>
+          <w:rFonts w:ascii="Calibri" w:hAnsi="Calibri" w:cs="Calibri"/>
+          <w:b/>
+          <w:bCs/>
+          <w:i/>
+          <w:iCs/>
+          <w:color w:val="1F3864"/>
+          <w:sz w:val="16"/>
+          <w:szCs w:val="16"/>
+          <w:highlight w:val="lightGray"/>
+          <w:lang w:val="en-PK"/>
+        </w:rPr>
+        <w:t xml:space="preserve">        // Checkpoint pass </w:t>
+      </w:r>
+      <w:proofErr w:type="spellStart"/>
+      <w:r>
+        <w:rPr>
+          <w:rFonts w:ascii="Calibri" w:hAnsi="Calibri" w:cs="Calibri"/>
+          <w:b/>
+          <w:bCs/>
+          <w:i/>
+          <w:iCs/>
+          <w:color w:val="1F3864"/>
+          <w:sz w:val="16"/>
+          <w:szCs w:val="16"/>
+          <w:highlight w:val="lightGray"/>
+          <w:lang w:val="en-PK"/>
+        </w:rPr>
+        <w:t>kiya</w:t>
+      </w:r>
+      <w:proofErr w:type="spellEnd"/>
+    </w:p>
+    <w:p>
+      <w:pPr>
+        <w:spacing w:before="100"/>
+        <w:rPr>
+          <w:rFonts w:ascii="Calibri" w:hAnsi="Calibri" w:cs="Calibri"/>
+          <w:b/>
+          <w:bCs/>
+          <w:i/>
+          <w:iCs/>
+          <w:color w:val="1F3864"/>
+          <w:sz w:val="16"/>
+          <w:szCs w:val="16"/>
+          <w:highlight w:val="lightGray"/>
+          <w:lang w:val="en-PK"/>
+        </w:rPr>
+      </w:pPr>
+      <w:r>
+        <w:rPr>
+          <w:rFonts w:ascii="Calibri" w:hAnsi="Calibri" w:cs="Calibri"/>
+          <w:b/>
+          <w:bCs/>
+          <w:i/>
+          <w:iCs/>
+          <w:color w:val="1F3864"/>
+          <w:sz w:val="16"/>
+          <w:szCs w:val="16"/>
+          <w:highlight w:val="lightGray"/>
+          <w:lang w:val="en-PK"/>
+        </w:rPr>
+        <w:t>        if (</w:t>
+      </w:r>
+      <w:proofErr w:type="spellStart"/>
+      <w:proofErr w:type="gramStart"/>
+      <w:r>
+        <w:rPr>
+          <w:rFonts w:ascii="Calibri" w:hAnsi="Calibri" w:cs="Calibri"/>
+          <w:b/>
+          <w:bCs/>
+          <w:i/>
+          <w:iCs/>
+          <w:color w:val="1F3864"/>
+          <w:sz w:val="16"/>
+          <w:szCs w:val="16"/>
+          <w:highlight w:val="lightGray"/>
+          <w:lang w:val="en-PK"/>
+        </w:rPr>
+        <w:t>other.CompareTag</w:t>
+      </w:r>
+      <w:proofErr w:type="spellEnd"/>
+      <w:proofErr w:type="gramEnd"/>
+      <w:r>
+        <w:rPr>
+          <w:rFonts w:ascii="Calibri" w:hAnsi="Calibri" w:cs="Calibri"/>
+          <w:b/>
+          <w:bCs/>
+          <w:i/>
+          <w:iCs/>
+          <w:color w:val="1F3864"/>
+          <w:sz w:val="16"/>
+          <w:szCs w:val="16"/>
+          <w:highlight w:val="lightGray"/>
+          <w:lang w:val="en-PK"/>
+        </w:rPr>
+        <w:t>("Checkpoint"))</w:t>
+      </w:r>
+    </w:p>
+    <w:p>
+      <w:pPr>
+        <w:spacing w:before="100"/>
+        <w:rPr>
+          <w:rFonts w:ascii="Calibri" w:hAnsi="Calibri" w:cs="Calibri"/>
+          <w:b/>
+          <w:bCs/>
+          <w:i/>
+          <w:iCs/>
+          <w:color w:val="1F3864"/>
+          <w:sz w:val="16"/>
+          <w:szCs w:val="16"/>
+          <w:highlight w:val="lightGray"/>
+          <w:lang w:val="en-PK"/>
+        </w:rPr>
+      </w:pPr>
+      <w:r>
+        <w:rPr>
+          <w:rFonts w:ascii="Calibri" w:hAnsi="Calibri" w:cs="Calibri"/>
+          <w:b/>
+          <w:bCs/>
+          <w:i/>
+          <w:iCs/>
+          <w:color w:val="1F3864"/>
+          <w:sz w:val="16"/>
+          <w:szCs w:val="16"/>
+          <w:highlight w:val="lightGray"/>
+          <w:lang w:val="en-PK"/>
+        </w:rPr>
+        <w:t>        {</w:t>
+      </w:r>
+    </w:p>
+    <w:p>
+      <w:pPr>
+        <w:spacing w:before="100"/>
+        <w:rPr>
+          <w:rFonts w:ascii="Calibri" w:hAnsi="Calibri" w:cs="Calibri"/>
+          <w:b/>
+          <w:bCs/>
+          <w:i/>
+          <w:iCs/>
+          <w:color w:val="1F3864"/>
+          <w:sz w:val="16"/>
+          <w:szCs w:val="16"/>
+          <w:highlight w:val="lightGray"/>
+          <w:lang w:val="en-PK"/>
+        </w:rPr>
+      </w:pPr>
+      <w:r>
+        <w:rPr>
+          <w:rFonts w:ascii="Calibri" w:hAnsi="Calibri" w:cs="Calibri"/>
+          <w:b/>
+          <w:bCs/>
+          <w:i/>
+          <w:iCs/>
+          <w:color w:val="1F3864"/>
+          <w:sz w:val="16"/>
+          <w:szCs w:val="16"/>
+          <w:highlight w:val="lightGray"/>
+          <w:lang w:val="en-PK"/>
+        </w:rPr>
+        <w:t xml:space="preserve">            int </w:t>
+      </w:r>
+      <w:proofErr w:type="spellStart"/>
+      <w:r>
+        <w:rPr>
+          <w:rFonts w:ascii="Calibri" w:hAnsi="Calibri" w:cs="Calibri"/>
+          <w:b/>
+          <w:bCs/>
+          <w:i/>
+          <w:iCs/>
+          <w:color w:val="1F3864"/>
+          <w:sz w:val="16"/>
+          <w:szCs w:val="16"/>
+          <w:highlight w:val="lightGray"/>
+          <w:lang w:val="en-PK"/>
+        </w:rPr>
+        <w:t>checkpointIndex</w:t>
+      </w:r>
+      <w:proofErr w:type="spellEnd"/>
+      <w:r>
+        <w:rPr>
+          <w:rFonts w:ascii="Calibri" w:hAnsi="Calibri" w:cs="Calibri"/>
+          <w:b/>
+          <w:bCs/>
+          <w:i/>
+          <w:iCs/>
+          <w:color w:val="1F3864"/>
+          <w:sz w:val="16"/>
+          <w:szCs w:val="16"/>
+          <w:highlight w:val="lightGray"/>
+          <w:lang w:val="en-PK"/>
+        </w:rPr>
+        <w:t xml:space="preserve"> = </w:t>
+      </w:r>
+      <w:proofErr w:type="spellStart"/>
+      <w:proofErr w:type="gramStart"/>
+      <w:r>
+        <w:rPr>
+          <w:rFonts w:ascii="Calibri" w:hAnsi="Calibri" w:cs="Calibri"/>
+          <w:b/>
+          <w:bCs/>
+          <w:i/>
+          <w:iCs/>
+          <w:color w:val="1F3864"/>
+          <w:sz w:val="16"/>
+          <w:szCs w:val="16"/>
+          <w:highlight w:val="lightGray"/>
+          <w:lang w:val="en-PK"/>
+        </w:rPr>
+        <w:t>other.GetComponent</w:t>
+      </w:r>
+      <w:proofErr w:type="spellEnd"/>
+      <w:proofErr w:type="gramEnd"/>
+      <w:r>
+        <w:rPr>
+          <w:rFonts w:ascii="Calibri" w:hAnsi="Calibri" w:cs="Calibri"/>
+          <w:b/>
+          <w:bCs/>
+          <w:i/>
+          <w:iCs/>
+          <w:color w:val="1F3864"/>
+          <w:sz w:val="16"/>
+          <w:szCs w:val="16"/>
+          <w:highlight w:val="lightGray"/>
+          <w:lang w:val="en-PK"/>
+        </w:rPr>
+        <w:t>&lt;</w:t>
+      </w:r>
+      <w:proofErr w:type="spellStart"/>
+      <w:r>
+        <w:rPr>
+          <w:rFonts w:ascii="Calibri" w:hAnsi="Calibri" w:cs="Calibri"/>
+          <w:b/>
+          <w:bCs/>
+          <w:i/>
+          <w:iCs/>
+          <w:color w:val="1F3864"/>
+          <w:sz w:val="16"/>
+          <w:szCs w:val="16"/>
+          <w:highlight w:val="lightGray"/>
+          <w:lang w:val="en-PK"/>
+        </w:rPr>
+        <w:t>CheckpointScript</w:t>
+      </w:r>
+      <w:proofErr w:type="spellEnd"/>
+      <w:proofErr w:type="gramStart"/>
+      <w:r>
+        <w:rPr>
+          <w:rFonts w:ascii="Calibri" w:hAnsi="Calibri" w:cs="Calibri"/>
+          <w:b/>
+          <w:bCs/>
+          <w:i/>
+          <w:iCs/>
+          <w:color w:val="1F3864"/>
+          <w:sz w:val="16"/>
+          <w:szCs w:val="16"/>
+          <w:highlight w:val="lightGray"/>
+          <w:lang w:val="en-PK"/>
+        </w:rPr>
+        <w:t>&gt;()?.index ??</w:t>
+      </w:r>
+      <w:proofErr w:type="gramEnd"/>
+      <w:r>
+        <w:rPr>
+          <w:rFonts w:ascii="Calibri" w:hAnsi="Calibri" w:cs="Calibri"/>
+          <w:b/>
+          <w:bCs/>
+          <w:i/>
+          <w:iCs/>
+          <w:color w:val="1F3864"/>
+          <w:sz w:val="16"/>
+          <w:szCs w:val="16"/>
+          <w:highlight w:val="lightGray"/>
+          <w:lang w:val="en-PK"/>
+        </w:rPr>
+        <w:t xml:space="preserve"> </w:t>
+      </w:r>
+      <w:proofErr w:type="gramStart"/>
+      <w:r>
+        <w:rPr>
+          <w:rFonts w:ascii="Calibri" w:hAnsi="Calibri" w:cs="Calibri"/>
+          <w:b/>
+          <w:bCs/>
+          <w:i/>
+          <w:iCs/>
+          <w:color w:val="1F3864"/>
+          <w:sz w:val="16"/>
+          <w:szCs w:val="16"/>
+          <w:highlight w:val="lightGray"/>
+          <w:lang w:val="en-PK"/>
+        </w:rPr>
+        <w:t>0;</w:t>
+      </w:r>
+      <w:proofErr w:type="gramEnd"/>
+    </w:p>
+    <w:p>
+      <w:pPr>
+        <w:spacing w:before="100"/>
+        <w:rPr>
+          <w:rFonts w:ascii="Calibri" w:hAnsi="Calibri" w:cs="Calibri"/>
+          <w:b/>
+          <w:bCs/>
+          <w:i/>
+          <w:iCs/>
+          <w:color w:val="1F3864"/>
+          <w:sz w:val="16"/>
+          <w:szCs w:val="16"/>
+          <w:highlight w:val="lightGray"/>
+          <w:lang w:val="en-PK"/>
+        </w:rPr>
+      </w:pPr>
+      <w:r>
+        <w:rPr>
+          <w:rFonts w:ascii="Calibri" w:hAnsi="Calibri" w:cs="Calibri"/>
+          <w:b/>
+          <w:bCs/>
+          <w:i/>
+          <w:iCs/>
+          <w:color w:val="1F3864"/>
+          <w:sz w:val="16"/>
+          <w:szCs w:val="16"/>
+          <w:highlight w:val="lightGray"/>
+          <w:lang w:val="en-PK"/>
+        </w:rPr>
+        <w:t>            if (</w:t>
+      </w:r>
+      <w:proofErr w:type="spellStart"/>
+      <w:r>
+        <w:rPr>
+          <w:rFonts w:ascii="Calibri" w:hAnsi="Calibri" w:cs="Calibri"/>
+          <w:b/>
+          <w:bCs/>
+          <w:i/>
+          <w:iCs/>
+          <w:color w:val="1F3864"/>
+          <w:sz w:val="16"/>
+          <w:szCs w:val="16"/>
+          <w:highlight w:val="lightGray"/>
+          <w:lang w:val="en-PK"/>
+        </w:rPr>
+        <w:t>checkpointIndex</w:t>
+      </w:r>
+      <w:proofErr w:type="spellEnd"/>
+      <w:r>
+        <w:rPr>
+          <w:rFonts w:ascii="Calibri" w:hAnsi="Calibri" w:cs="Calibri"/>
+          <w:b/>
+          <w:bCs/>
+          <w:i/>
+          <w:iCs/>
+          <w:color w:val="1F3864"/>
+          <w:sz w:val="16"/>
+          <w:szCs w:val="16"/>
+          <w:highlight w:val="lightGray"/>
+          <w:lang w:val="en-PK"/>
+        </w:rPr>
+        <w:t xml:space="preserve"> == </w:t>
+      </w:r>
+      <w:proofErr w:type="spellStart"/>
+      <w:r>
+        <w:rPr>
+          <w:rFonts w:ascii="Calibri" w:hAnsi="Calibri" w:cs="Calibri"/>
+          <w:b/>
+          <w:bCs/>
+          <w:i/>
+          <w:iCs/>
+          <w:color w:val="1F3864"/>
+          <w:sz w:val="16"/>
+          <w:szCs w:val="16"/>
+          <w:highlight w:val="lightGray"/>
+          <w:lang w:val="en-PK"/>
+        </w:rPr>
+        <w:t>currentCheckpoint</w:t>
+      </w:r>
+      <w:proofErr w:type="spellEnd"/>
+      <w:r>
+        <w:rPr>
+          <w:rFonts w:ascii="Calibri" w:hAnsi="Calibri" w:cs="Calibri"/>
+          <w:b/>
+          <w:bCs/>
+          <w:i/>
+          <w:iCs/>
+          <w:color w:val="1F3864"/>
+          <w:sz w:val="16"/>
+          <w:szCs w:val="16"/>
+          <w:highlight w:val="lightGray"/>
+          <w:lang w:val="en-PK"/>
+        </w:rPr>
+        <w:t>)</w:t>
+      </w:r>
+    </w:p>
+    <w:p>
+      <w:pPr>
+        <w:spacing w:before="100"/>
+        <w:rPr>
+          <w:rFonts w:ascii="Calibri" w:hAnsi="Calibri" w:cs="Calibri"/>
+          <w:b/>
+          <w:bCs/>
+          <w:i/>
+          <w:iCs/>
+          <w:color w:val="1F3864"/>
+          <w:sz w:val="16"/>
+          <w:szCs w:val="16"/>
+          <w:highlight w:val="lightGray"/>
+          <w:lang w:val="en-PK"/>
+        </w:rPr>
+      </w:pPr>
+      <w:r>
+        <w:rPr>
+          <w:rFonts w:ascii="Calibri" w:hAnsi="Calibri" w:cs="Calibri"/>
+          <w:b/>
+          <w:bCs/>
+          <w:i/>
+          <w:iCs/>
+          <w:color w:val="1F3864"/>
+          <w:sz w:val="16"/>
+          <w:szCs w:val="16"/>
+          <w:highlight w:val="lightGray"/>
+          <w:lang w:val="en-PK"/>
+        </w:rPr>
+        <w:t>            {</w:t>
+      </w:r>
+    </w:p>
+    <w:p>
+      <w:pPr>
+        <w:spacing w:before="100"/>
+        <w:rPr>
+          <w:rFonts w:ascii="Calibri" w:hAnsi="Calibri" w:cs="Calibri"/>
+          <w:b/>
+          <w:bCs/>
+          <w:i/>
+          <w:iCs/>
+          <w:color w:val="1F3864"/>
+          <w:sz w:val="16"/>
+          <w:szCs w:val="16"/>
+          <w:highlight w:val="lightGray"/>
+          <w:lang w:val="en-PK"/>
+        </w:rPr>
+      </w:pPr>
+      <w:r>
+        <w:rPr>
+          <w:rFonts w:ascii="Calibri" w:hAnsi="Calibri" w:cs="Calibri"/>
+          <w:b/>
+          <w:bCs/>
+          <w:i/>
+          <w:iCs/>
+          <w:color w:val="1F3864"/>
+          <w:sz w:val="16"/>
+          <w:szCs w:val="16"/>
+          <w:highlight w:val="lightGray"/>
+          <w:lang w:val="en-PK"/>
+        </w:rPr>
+        <w:t xml:space="preserve">                </w:t>
+      </w:r>
+      <w:proofErr w:type="spellStart"/>
+      <w:proofErr w:type="gramStart"/>
+      <w:r>
+        <w:rPr>
+          <w:rFonts w:ascii="Calibri" w:hAnsi="Calibri" w:cs="Calibri"/>
+          <w:b/>
+          <w:bCs/>
+          <w:i/>
+          <w:iCs/>
+          <w:color w:val="1F3864"/>
+          <w:sz w:val="16"/>
+          <w:szCs w:val="16"/>
+          <w:highlight w:val="lightGray"/>
+          <w:lang w:val="en-PK"/>
+        </w:rPr>
+        <w:t>AddReward</w:t>
+      </w:r>
+      <w:proofErr w:type="spellEnd"/>
+      <w:r>
+        <w:rPr>
+          <w:rFonts w:ascii="Calibri" w:hAnsi="Calibri" w:cs="Calibri"/>
+          <w:b/>
+          <w:bCs/>
+          <w:i/>
+          <w:iCs/>
+          <w:color w:val="1F3864"/>
+          <w:sz w:val="16"/>
+          <w:szCs w:val="16"/>
+          <w:highlight w:val="lightGray"/>
+          <w:lang w:val="en-PK"/>
+        </w:rPr>
+        <w:t>(</w:t>
+      </w:r>
+      <w:proofErr w:type="gramEnd"/>
+      <w:r>
+        <w:rPr>
+          <w:rFonts w:ascii="Calibri" w:hAnsi="Calibri" w:cs="Calibri"/>
+          <w:b/>
+          <w:bCs/>
+          <w:i/>
+          <w:iCs/>
+          <w:color w:val="1F3864"/>
+          <w:sz w:val="16"/>
+          <w:szCs w:val="16"/>
+          <w:highlight w:val="lightGray"/>
+          <w:lang w:val="en-PK"/>
+        </w:rPr>
+        <w:t>1.0f</w:t>
+      </w:r>
+      <w:proofErr w:type="gramStart"/>
+      <w:r>
+        <w:rPr>
+          <w:rFonts w:ascii="Calibri" w:hAnsi="Calibri" w:cs="Calibri"/>
+          <w:b/>
+          <w:bCs/>
+          <w:i/>
+          <w:iCs/>
+          <w:color w:val="1F3864"/>
+          <w:sz w:val="16"/>
+          <w:szCs w:val="16"/>
+          <w:highlight w:val="lightGray"/>
+          <w:lang w:val="en-PK"/>
+        </w:rPr>
+        <w:t xml:space="preserve">);   </w:t>
+      </w:r>
+      <w:proofErr w:type="gramEnd"/>
+      <w:r>
+        <w:rPr>
+          <w:rFonts w:ascii="Calibri" w:hAnsi="Calibri" w:cs="Calibri"/>
+          <w:b/>
+          <w:bCs/>
+          <w:i/>
+          <w:iCs/>
+          <w:color w:val="1F3864"/>
+          <w:sz w:val="16"/>
+          <w:szCs w:val="16"/>
+          <w:highlight w:val="lightGray"/>
+          <w:lang w:val="en-PK"/>
+        </w:rPr>
+        <w:t> // Checkpoint reward</w:t>
+      </w:r>
+    </w:p>
+    <w:p>
+      <w:pPr>
+        <w:spacing w:before="100"/>
+        <w:rPr>
+          <w:rFonts w:ascii="Calibri" w:hAnsi="Calibri" w:cs="Calibri"/>
+          <w:b/>
+          <w:bCs/>
+          <w:i/>
+          <w:iCs/>
+          <w:color w:val="1F3864"/>
+          <w:sz w:val="16"/>
+          <w:szCs w:val="16"/>
+          <w:highlight w:val="lightGray"/>
+          <w:lang w:val="en-PK"/>
+        </w:rPr>
+      </w:pPr>
+      <w:r>
+        <w:rPr>
+          <w:rFonts w:ascii="Calibri" w:hAnsi="Calibri" w:cs="Calibri"/>
+          <w:b/>
+          <w:bCs/>
+          <w:i/>
+          <w:iCs/>
+          <w:color w:val="1F3864"/>
+          <w:sz w:val="16"/>
+          <w:szCs w:val="16"/>
+          <w:highlight w:val="lightGray"/>
+          <w:lang w:val="en-PK"/>
+        </w:rPr>
+        <w:t xml:space="preserve">                </w:t>
+      </w:r>
+      <w:proofErr w:type="spellStart"/>
+      <w:r>
+        <w:rPr>
+          <w:rFonts w:ascii="Calibri" w:hAnsi="Calibri" w:cs="Calibri"/>
+          <w:b/>
+          <w:bCs/>
+          <w:i/>
+          <w:iCs/>
+          <w:color w:val="1F3864"/>
+          <w:sz w:val="16"/>
+          <w:szCs w:val="16"/>
+          <w:highlight w:val="lightGray"/>
+          <w:lang w:val="en-PK"/>
+        </w:rPr>
+        <w:t>currentCheckpoint</w:t>
+      </w:r>
+      <w:proofErr w:type="spellEnd"/>
+      <w:r>
+        <w:rPr>
+          <w:rFonts w:ascii="Calibri" w:hAnsi="Calibri" w:cs="Calibri"/>
+          <w:b/>
+          <w:bCs/>
+          <w:i/>
+          <w:iCs/>
+          <w:color w:val="1F3864"/>
+          <w:sz w:val="16"/>
+          <w:szCs w:val="16"/>
+          <w:highlight w:val="lightGray"/>
+          <w:lang w:val="en-PK"/>
+        </w:rPr>
+        <w:t>+</w:t>
+      </w:r>
+      <w:proofErr w:type="gramStart"/>
+      <w:r>
+        <w:rPr>
+          <w:rFonts w:ascii="Calibri" w:hAnsi="Calibri" w:cs="Calibri"/>
+          <w:b/>
+          <w:bCs/>
+          <w:i/>
+          <w:iCs/>
+          <w:color w:val="1F3864"/>
+          <w:sz w:val="16"/>
+          <w:szCs w:val="16"/>
+          <w:highlight w:val="lightGray"/>
+          <w:lang w:val="en-PK"/>
+        </w:rPr>
+        <w:t>+;</w:t>
+      </w:r>
+      <w:proofErr w:type="gramEnd"/>
+    </w:p>
+    <w:p>
+      <w:pPr>
+        <w:spacing w:before="100"/>
+        <w:rPr>
+          <w:rFonts w:ascii="Calibri" w:hAnsi="Calibri" w:cs="Calibri"/>
+          <w:b/>
+          <w:bCs/>
+          <w:i/>
+          <w:iCs/>
+          <w:color w:val="1F3864"/>
+          <w:sz w:val="16"/>
+          <w:szCs w:val="16"/>
+          <w:highlight w:val="lightGray"/>
+          <w:lang w:val="en-PK"/>
+        </w:rPr>
+      </w:pPr>
+      <w:r>
+        <w:rPr>
+          <w:rFonts w:ascii="Calibri" w:hAnsi="Calibri" w:cs="Calibri"/>
+          <w:b/>
+          <w:bCs/>
+          <w:i/>
+          <w:iCs/>
+          <w:color w:val="1F3864"/>
+          <w:sz w:val="16"/>
+          <w:szCs w:val="16"/>
+          <w:highlight w:val="lightGray"/>
+          <w:lang w:val="en-PK"/>
+        </w:rPr>
+        <w:t xml:space="preserve">                </w:t>
+      </w:r>
+      <w:proofErr w:type="spellStart"/>
+      <w:r>
+        <w:rPr>
+          <w:rFonts w:ascii="Calibri" w:hAnsi="Calibri" w:cs="Calibri"/>
+          <w:b/>
+          <w:bCs/>
+          <w:i/>
+          <w:iCs/>
+          <w:color w:val="1F3864"/>
+          <w:sz w:val="16"/>
+          <w:szCs w:val="16"/>
+          <w:highlight w:val="lightGray"/>
+          <w:lang w:val="en-PK"/>
+        </w:rPr>
+        <w:t>totalCheckpointsPassed</w:t>
+      </w:r>
+      <w:proofErr w:type="spellEnd"/>
+      <w:r>
+        <w:rPr>
+          <w:rFonts w:ascii="Calibri" w:hAnsi="Calibri" w:cs="Calibri"/>
+          <w:b/>
+          <w:bCs/>
+          <w:i/>
+          <w:iCs/>
+          <w:color w:val="1F3864"/>
+          <w:sz w:val="16"/>
+          <w:szCs w:val="16"/>
+          <w:highlight w:val="lightGray"/>
+          <w:lang w:val="en-PK"/>
+        </w:rPr>
+        <w:t>+</w:t>
+      </w:r>
+      <w:proofErr w:type="gramStart"/>
+      <w:r>
+        <w:rPr>
+          <w:rFonts w:ascii="Calibri" w:hAnsi="Calibri" w:cs="Calibri"/>
+          <w:b/>
+          <w:bCs/>
+          <w:i/>
+          <w:iCs/>
+          <w:color w:val="1F3864"/>
+          <w:sz w:val="16"/>
+          <w:szCs w:val="16"/>
+          <w:highlight w:val="lightGray"/>
+          <w:lang w:val="en-PK"/>
+        </w:rPr>
+        <w:t>+;</w:t>
+      </w:r>
+      <w:proofErr w:type="gramEnd"/>
+    </w:p>
+    <w:p>
+      <w:pPr>
+        <w:spacing w:before="100"/>
+        <w:rPr>
+          <w:rFonts w:ascii="Calibri" w:hAnsi="Calibri" w:cs="Calibri"/>
+          <w:b/>
+          <w:bCs/>
+          <w:i/>
+          <w:iCs/>
+          <w:color w:val="1F3864"/>
+          <w:sz w:val="16"/>
+          <w:szCs w:val="16"/>
+          <w:highlight w:val="lightGray"/>
+          <w:lang w:val="en-PK"/>
+        </w:rPr>
+      </w:pPr>
+    </w:p>
+    <w:p>
+      <w:pPr>
+        <w:spacing w:before="100"/>
+        <w:rPr>
+          <w:rFonts w:ascii="Calibri" w:hAnsi="Calibri" w:cs="Calibri"/>
+          <w:b/>
+          <w:bCs/>
+          <w:i/>
+          <w:iCs/>
+          <w:color w:val="1F3864"/>
+          <w:sz w:val="16"/>
+          <w:szCs w:val="16"/>
+          <w:highlight w:val="lightGray"/>
+          <w:lang w:val="en-PK"/>
+        </w:rPr>
+      </w:pPr>
+      <w:r>
+        <w:rPr>
+          <w:rFonts w:ascii="Calibri" w:hAnsi="Calibri" w:cs="Calibri"/>
+          <w:b/>
+          <w:bCs/>
+          <w:i/>
+          <w:iCs/>
+          <w:color w:val="1F3864"/>
+          <w:sz w:val="16"/>
+          <w:szCs w:val="16"/>
+          <w:highlight w:val="lightGray"/>
+          <w:lang w:val="en-PK"/>
+        </w:rPr>
+        <w:t xml:space="preserve">                // Saare checkpoints pass </w:t>
+      </w:r>
+      <w:proofErr w:type="spellStart"/>
+      <w:r>
+        <w:rPr>
+          <w:rFonts w:ascii="Calibri" w:hAnsi="Calibri" w:cs="Calibri"/>
+          <w:b/>
+          <w:bCs/>
+          <w:i/>
+          <w:iCs/>
+          <w:color w:val="1F3864"/>
+          <w:sz w:val="16"/>
+          <w:szCs w:val="16"/>
+          <w:highlight w:val="lightGray"/>
+          <w:lang w:val="en-PK"/>
+        </w:rPr>
+        <w:t>kar</w:t>
+      </w:r>
+      <w:proofErr w:type="spellEnd"/>
+      <w:r>
+        <w:rPr>
+          <w:rFonts w:ascii="Calibri" w:hAnsi="Calibri" w:cs="Calibri"/>
+          <w:b/>
+          <w:bCs/>
+          <w:i/>
+          <w:iCs/>
+          <w:color w:val="1F3864"/>
+          <w:sz w:val="16"/>
+          <w:szCs w:val="16"/>
+          <w:highlight w:val="lightGray"/>
+          <w:lang w:val="en-PK"/>
+        </w:rPr>
+        <w:t xml:space="preserve"> </w:t>
+      </w:r>
+      <w:proofErr w:type="spellStart"/>
+      <w:r>
+        <w:rPr>
+          <w:rFonts w:ascii="Calibri" w:hAnsi="Calibri" w:cs="Calibri"/>
+          <w:b/>
+          <w:bCs/>
+          <w:i/>
+          <w:iCs/>
+          <w:color w:val="1F3864"/>
+          <w:sz w:val="16"/>
+          <w:szCs w:val="16"/>
+          <w:highlight w:val="lightGray"/>
+          <w:lang w:val="en-PK"/>
+        </w:rPr>
+        <w:t>liye</w:t>
+      </w:r>
+      <w:proofErr w:type="spellEnd"/>
+      <w:r>
+        <w:rPr>
+          <w:rFonts w:ascii="Calibri" w:hAnsi="Calibri" w:cs="Calibri"/>
+          <w:b/>
+          <w:bCs/>
+          <w:i/>
+          <w:iCs/>
+          <w:color w:val="1F3864"/>
+          <w:sz w:val="16"/>
+          <w:szCs w:val="16"/>
+          <w:highlight w:val="lightGray"/>
+          <w:lang w:val="en-PK"/>
+        </w:rPr>
+        <w:t xml:space="preserve"> = episode complete</w:t>
+      </w:r>
+    </w:p>
+    <w:p>
+      <w:pPr>
+        <w:spacing w:before="100"/>
+        <w:rPr>
+          <w:rFonts w:ascii="Calibri" w:hAnsi="Calibri" w:cs="Calibri"/>
+          <w:b/>
+          <w:bCs/>
+          <w:i/>
+          <w:iCs/>
+          <w:color w:val="1F3864"/>
+          <w:sz w:val="16"/>
+          <w:szCs w:val="16"/>
+          <w:highlight w:val="lightGray"/>
+          <w:lang w:val="en-PK"/>
+        </w:rPr>
+      </w:pPr>
+      <w:r>
+        <w:rPr>
+          <w:rFonts w:ascii="Calibri" w:hAnsi="Calibri" w:cs="Calibri"/>
+          <w:b/>
+          <w:bCs/>
+          <w:i/>
+          <w:iCs/>
+          <w:color w:val="1F3864"/>
+          <w:sz w:val="16"/>
+          <w:szCs w:val="16"/>
+          <w:highlight w:val="lightGray"/>
+          <w:lang w:val="en-PK"/>
+        </w:rPr>
+        <w:t>                if (</w:t>
+      </w:r>
+      <w:proofErr w:type="spellStart"/>
+      <w:r>
+        <w:rPr>
+          <w:rFonts w:ascii="Calibri" w:hAnsi="Calibri" w:cs="Calibri"/>
+          <w:b/>
+          <w:bCs/>
+          <w:i/>
+          <w:iCs/>
+          <w:color w:val="1F3864"/>
+          <w:sz w:val="16"/>
+          <w:szCs w:val="16"/>
+          <w:highlight w:val="lightGray"/>
+          <w:lang w:val="en-PK"/>
+        </w:rPr>
+        <w:t>currentCheckpoint</w:t>
+      </w:r>
+      <w:proofErr w:type="spellEnd"/>
+      <w:r>
+        <w:rPr>
+          <w:rFonts w:ascii="Calibri" w:hAnsi="Calibri" w:cs="Calibri"/>
+          <w:b/>
+          <w:bCs/>
+          <w:i/>
+          <w:iCs/>
+          <w:color w:val="1F3864"/>
+          <w:sz w:val="16"/>
+          <w:szCs w:val="16"/>
+          <w:highlight w:val="lightGray"/>
+          <w:lang w:val="en-PK"/>
+        </w:rPr>
+        <w:t xml:space="preserve"> &gt;= </w:t>
+      </w:r>
+      <w:proofErr w:type="spellStart"/>
+      <w:proofErr w:type="gramStart"/>
+      <w:r>
+        <w:rPr>
+          <w:rFonts w:ascii="Calibri" w:hAnsi="Calibri" w:cs="Calibri"/>
+          <w:b/>
+          <w:bCs/>
+          <w:i/>
+          <w:iCs/>
+          <w:color w:val="1F3864"/>
+          <w:sz w:val="16"/>
+          <w:szCs w:val="16"/>
+          <w:highlight w:val="lightGray"/>
+          <w:lang w:val="en-PK"/>
+        </w:rPr>
+        <w:t>checkpoints.Length</w:t>
+      </w:r>
+      <w:proofErr w:type="spellEnd"/>
+      <w:proofErr w:type="gramEnd"/>
+      <w:r>
+        <w:rPr>
+          <w:rFonts w:ascii="Calibri" w:hAnsi="Calibri" w:cs="Calibri"/>
+          <w:b/>
+          <w:bCs/>
+          <w:i/>
+          <w:iCs/>
+          <w:color w:val="1F3864"/>
+          <w:sz w:val="16"/>
+          <w:szCs w:val="16"/>
+          <w:highlight w:val="lightGray"/>
+          <w:lang w:val="en-PK"/>
+        </w:rPr>
+        <w:t>)</w:t>
+      </w:r>
+    </w:p>
+    <w:p>
+      <w:pPr>
+        <w:spacing w:before="100"/>
+        <w:rPr>
+          <w:rFonts w:ascii="Calibri" w:hAnsi="Calibri" w:cs="Calibri"/>
+          <w:b/>
+          <w:bCs/>
+          <w:i/>
+          <w:iCs/>
+          <w:color w:val="1F3864"/>
+          <w:sz w:val="16"/>
+          <w:szCs w:val="16"/>
+          <w:highlight w:val="lightGray"/>
+          <w:lang w:val="en-PK"/>
+        </w:rPr>
+      </w:pPr>
+      <w:r>
+        <w:rPr>
+          <w:rFonts w:ascii="Calibri" w:hAnsi="Calibri" w:cs="Calibri"/>
+          <w:b/>
+          <w:bCs/>
+          <w:i/>
+          <w:iCs/>
+          <w:color w:val="1F3864"/>
+          <w:sz w:val="16"/>
+          <w:szCs w:val="16"/>
+          <w:highlight w:val="lightGray"/>
+          <w:lang w:val="en-PK"/>
+        </w:rPr>
+        <w:t>                {</w:t>
+      </w:r>
+    </w:p>
+    <w:p>
+      <w:pPr>
+        <w:spacing w:before="100"/>
+        <w:rPr>
+          <w:rFonts w:ascii="Calibri" w:hAnsi="Calibri" w:cs="Calibri"/>
+          <w:b/>
+          <w:bCs/>
+          <w:i/>
+          <w:iCs/>
+          <w:color w:val="1F3864"/>
+          <w:sz w:val="16"/>
+          <w:szCs w:val="16"/>
+          <w:highlight w:val="lightGray"/>
+          <w:lang w:val="en-PK"/>
+        </w:rPr>
+      </w:pPr>
+      <w:r>
+        <w:rPr>
+          <w:rFonts w:ascii="Calibri" w:hAnsi="Calibri" w:cs="Calibri"/>
+          <w:b/>
+          <w:bCs/>
+          <w:i/>
+          <w:iCs/>
+          <w:color w:val="1F3864"/>
+          <w:sz w:val="16"/>
+          <w:szCs w:val="16"/>
+          <w:highlight w:val="lightGray"/>
+          <w:lang w:val="en-PK"/>
+        </w:rPr>
+        <w:t xml:space="preserve">                    </w:t>
+      </w:r>
+      <w:proofErr w:type="spellStart"/>
+      <w:proofErr w:type="gramStart"/>
+      <w:r>
+        <w:rPr>
+          <w:rFonts w:ascii="Calibri" w:hAnsi="Calibri" w:cs="Calibri"/>
+          <w:b/>
+          <w:bCs/>
+          <w:i/>
+          <w:iCs/>
+          <w:color w:val="1F3864"/>
+          <w:sz w:val="16"/>
+          <w:szCs w:val="16"/>
+          <w:highlight w:val="lightGray"/>
+          <w:lang w:val="en-PK"/>
+        </w:rPr>
+        <w:t>AddReward</w:t>
+      </w:r>
+      <w:proofErr w:type="spellEnd"/>
+      <w:r>
+        <w:rPr>
+          <w:rFonts w:ascii="Calibri" w:hAnsi="Calibri" w:cs="Calibri"/>
+          <w:b/>
+          <w:bCs/>
+          <w:i/>
+          <w:iCs/>
+          <w:color w:val="1F3864"/>
+          <w:sz w:val="16"/>
+          <w:szCs w:val="16"/>
+          <w:highlight w:val="lightGray"/>
+          <w:lang w:val="en-PK"/>
+        </w:rPr>
+        <w:t>(</w:t>
+      </w:r>
+      <w:proofErr w:type="gramEnd"/>
+      <w:r>
+        <w:rPr>
+          <w:rFonts w:ascii="Calibri" w:hAnsi="Calibri" w:cs="Calibri"/>
+          <w:b/>
+          <w:bCs/>
+          <w:i/>
+          <w:iCs/>
+          <w:color w:val="1F3864"/>
+          <w:sz w:val="16"/>
+          <w:szCs w:val="16"/>
+          <w:highlight w:val="lightGray"/>
+          <w:lang w:val="en-PK"/>
+        </w:rPr>
+        <w:t>5.0f</w:t>
+      </w:r>
+      <w:proofErr w:type="gramStart"/>
+      <w:r>
+        <w:rPr>
+          <w:rFonts w:ascii="Calibri" w:hAnsi="Calibri" w:cs="Calibri"/>
+          <w:b/>
+          <w:bCs/>
+          <w:i/>
+          <w:iCs/>
+          <w:color w:val="1F3864"/>
+          <w:sz w:val="16"/>
+          <w:szCs w:val="16"/>
+          <w:highlight w:val="lightGray"/>
+          <w:lang w:val="en-PK"/>
+        </w:rPr>
+        <w:t xml:space="preserve">);   </w:t>
+      </w:r>
+      <w:proofErr w:type="gramEnd"/>
+      <w:r>
+        <w:rPr>
+          <w:rFonts w:ascii="Calibri" w:hAnsi="Calibri" w:cs="Calibri"/>
+          <w:b/>
+          <w:bCs/>
+          <w:i/>
+          <w:iCs/>
+          <w:color w:val="1F3864"/>
+          <w:sz w:val="16"/>
+          <w:szCs w:val="16"/>
+          <w:highlight w:val="lightGray"/>
+          <w:lang w:val="en-PK"/>
+        </w:rPr>
+        <w:t>// Lap complete reward!</w:t>
+      </w:r>
+    </w:p>
+    <w:p>
+      <w:pPr>
+        <w:spacing w:before="100"/>
+        <w:rPr>
+          <w:rFonts w:ascii="Calibri" w:hAnsi="Calibri" w:cs="Calibri"/>
+          <w:b/>
+          <w:bCs/>
+          <w:i/>
+          <w:iCs/>
+          <w:color w:val="1F3864"/>
+          <w:sz w:val="16"/>
+          <w:szCs w:val="16"/>
+          <w:highlight w:val="lightGray"/>
+          <w:lang w:val="en-PK"/>
+        </w:rPr>
+      </w:pPr>
+      <w:r>
+        <w:rPr>
+          <w:rFonts w:ascii="Calibri" w:hAnsi="Calibri" w:cs="Calibri"/>
+          <w:b/>
+          <w:bCs/>
+          <w:i/>
+          <w:iCs/>
+          <w:color w:val="1F3864"/>
+          <w:sz w:val="16"/>
+          <w:szCs w:val="16"/>
+          <w:highlight w:val="lightGray"/>
+          <w:lang w:val="en-PK"/>
+        </w:rPr>
+        <w:t xml:space="preserve">                    </w:t>
+      </w:r>
+      <w:proofErr w:type="spellStart"/>
+      <w:proofErr w:type="gramStart"/>
+      <w:r>
+        <w:rPr>
+          <w:rFonts w:ascii="Calibri" w:hAnsi="Calibri" w:cs="Calibri"/>
+          <w:b/>
+          <w:bCs/>
+          <w:i/>
+          <w:iCs/>
+          <w:color w:val="1F3864"/>
+          <w:sz w:val="16"/>
+          <w:szCs w:val="16"/>
+          <w:highlight w:val="lightGray"/>
+          <w:lang w:val="en-PK"/>
+        </w:rPr>
+        <w:t>EndEpisode</w:t>
+      </w:r>
+      <w:proofErr w:type="spellEnd"/>
+      <w:r>
+        <w:rPr>
+          <w:rFonts w:ascii="Calibri" w:hAnsi="Calibri" w:cs="Calibri"/>
+          <w:b/>
+          <w:bCs/>
+          <w:i/>
+          <w:iCs/>
+          <w:color w:val="1F3864"/>
+          <w:sz w:val="16"/>
+          <w:szCs w:val="16"/>
+          <w:highlight w:val="lightGray"/>
+          <w:lang w:val="en-PK"/>
+        </w:rPr>
+        <w:t>();</w:t>
+      </w:r>
+      <w:proofErr w:type="gramEnd"/>
+    </w:p>
+    <w:p>
+      <w:pPr>
+        <w:spacing w:before="100"/>
+        <w:rPr>
+          <w:rFonts w:ascii="Calibri" w:hAnsi="Calibri" w:cs="Calibri"/>
+          <w:b/>
+          <w:bCs/>
+          <w:i/>
+          <w:iCs/>
+          <w:color w:val="1F3864"/>
+          <w:sz w:val="16"/>
+          <w:szCs w:val="16"/>
+          <w:highlight w:val="lightGray"/>
+          <w:lang w:val="en-PK"/>
+        </w:rPr>
+      </w:pPr>
+      <w:r>
+        <w:rPr>
+          <w:rFonts w:ascii="Calibri" w:hAnsi="Calibri" w:cs="Calibri"/>
+          <w:b/>
+          <w:bCs/>
+          <w:i/>
+          <w:iCs/>
+          <w:color w:val="1F3864"/>
+          <w:sz w:val="16"/>
+          <w:szCs w:val="16"/>
+          <w:highlight w:val="lightGray"/>
+          <w:lang w:val="en-PK"/>
+        </w:rPr>
+        <w:t>                }</w:t>
+      </w:r>
+    </w:p>
+    <w:p>
+      <w:pPr>
+        <w:spacing w:before="100"/>
+        <w:rPr>
+          <w:rFonts w:ascii="Calibri" w:hAnsi="Calibri" w:cs="Calibri"/>
+          <w:b/>
+          <w:bCs/>
+          <w:i/>
+          <w:iCs/>
+          <w:color w:val="1F3864"/>
+          <w:sz w:val="16"/>
+          <w:szCs w:val="16"/>
+          <w:highlight w:val="lightGray"/>
+          <w:lang w:val="en-PK"/>
+        </w:rPr>
+      </w:pPr>
+      <w:r>
+        <w:rPr>
+          <w:rFonts w:ascii="Calibri" w:hAnsi="Calibri" w:cs="Calibri"/>
+          <w:b/>
+          <w:bCs/>
+          <w:i/>
+          <w:iCs/>
+          <w:color w:val="1F3864"/>
+          <w:sz w:val="16"/>
+          <w:szCs w:val="16"/>
+          <w:highlight w:val="lightGray"/>
+          <w:lang w:val="en-PK"/>
+        </w:rPr>
+        <w:t>                else if (</w:t>
+      </w:r>
+      <w:proofErr w:type="gramStart"/>
+      <w:r>
+        <w:rPr>
+          <w:rFonts w:ascii="Calibri" w:hAnsi="Calibri" w:cs="Calibri"/>
+          <w:b/>
+          <w:bCs/>
+          <w:i/>
+          <w:iCs/>
+          <w:color w:val="1F3864"/>
+          <w:sz w:val="16"/>
+          <w:szCs w:val="16"/>
+          <w:highlight w:val="lightGray"/>
+          <w:lang w:val="en-PK"/>
+        </w:rPr>
+        <w:t>checkpoints !</w:t>
+      </w:r>
+      <w:proofErr w:type="gramEnd"/>
+      <w:r>
+        <w:rPr>
+          <w:rFonts w:ascii="Calibri" w:hAnsi="Calibri" w:cs="Calibri"/>
+          <w:b/>
+          <w:bCs/>
+          <w:i/>
+          <w:iCs/>
+          <w:color w:val="1F3864"/>
+          <w:sz w:val="16"/>
+          <w:szCs w:val="16"/>
+          <w:highlight w:val="lightGray"/>
+          <w:lang w:val="en-PK"/>
+        </w:rPr>
+        <w:t xml:space="preserve">= null &amp;&amp; </w:t>
+      </w:r>
+      <w:proofErr w:type="spellStart"/>
+      <w:r>
+        <w:rPr>
+          <w:rFonts w:ascii="Calibri" w:hAnsi="Calibri" w:cs="Calibri"/>
+          <w:b/>
+          <w:bCs/>
+          <w:i/>
+          <w:iCs/>
+          <w:color w:val="1F3864"/>
+          <w:sz w:val="16"/>
+          <w:szCs w:val="16"/>
+          <w:highlight w:val="lightGray"/>
+          <w:lang w:val="en-PK"/>
+        </w:rPr>
+        <w:t>currentCheckpoint</w:t>
+      </w:r>
+      <w:proofErr w:type="spellEnd"/>
+      <w:r>
+        <w:rPr>
+          <w:rFonts w:ascii="Calibri" w:hAnsi="Calibri" w:cs="Calibri"/>
+          <w:b/>
+          <w:bCs/>
+          <w:i/>
+          <w:iCs/>
+          <w:color w:val="1F3864"/>
+          <w:sz w:val="16"/>
+          <w:szCs w:val="16"/>
+          <w:highlight w:val="lightGray"/>
+          <w:lang w:val="en-PK"/>
+        </w:rPr>
+        <w:t xml:space="preserve"> &lt; </w:t>
+      </w:r>
+      <w:proofErr w:type="spellStart"/>
+      <w:proofErr w:type="gramStart"/>
+      <w:r>
+        <w:rPr>
+          <w:rFonts w:ascii="Calibri" w:hAnsi="Calibri" w:cs="Calibri"/>
+          <w:b/>
+          <w:bCs/>
+          <w:i/>
+          <w:iCs/>
+          <w:color w:val="1F3864"/>
+          <w:sz w:val="16"/>
+          <w:szCs w:val="16"/>
+          <w:highlight w:val="lightGray"/>
+          <w:lang w:val="en-PK"/>
+        </w:rPr>
+        <w:t>checkpoints.Length</w:t>
+      </w:r>
+      <w:proofErr w:type="spellEnd"/>
+      <w:proofErr w:type="gramEnd"/>
+      <w:r>
+        <w:rPr>
+          <w:rFonts w:ascii="Calibri" w:hAnsi="Calibri" w:cs="Calibri"/>
+          <w:b/>
+          <w:bCs/>
+          <w:i/>
+          <w:iCs/>
+          <w:color w:val="1F3864"/>
+          <w:sz w:val="16"/>
+          <w:szCs w:val="16"/>
+          <w:highlight w:val="lightGray"/>
+          <w:lang w:val="en-PK"/>
+        </w:rPr>
+        <w:t>)</w:t>
+      </w:r>
+    </w:p>
+    <w:p>
+      <w:pPr>
+        <w:spacing w:before="100"/>
+        <w:rPr>
+          <w:rFonts w:ascii="Calibri" w:hAnsi="Calibri" w:cs="Calibri"/>
+          <w:b/>
+          <w:bCs/>
+          <w:i/>
+          <w:iCs/>
+          <w:color w:val="1F3864"/>
+          <w:sz w:val="16"/>
+          <w:szCs w:val="16"/>
+          <w:highlight w:val="lightGray"/>
+          <w:lang w:val="en-PK"/>
+        </w:rPr>
+      </w:pPr>
+      <w:r>
+        <w:rPr>
+          <w:rFonts w:ascii="Calibri" w:hAnsi="Calibri" w:cs="Calibri"/>
+          <w:b/>
+          <w:bCs/>
+          <w:i/>
+          <w:iCs/>
+          <w:color w:val="1F3864"/>
+          <w:sz w:val="16"/>
+          <w:szCs w:val="16"/>
+          <w:highlight w:val="lightGray"/>
+          <w:lang w:val="en-PK"/>
+        </w:rPr>
+        <w:t>                {</w:t>
+      </w:r>
+    </w:p>
+    <w:p>
+      <w:pPr>
+        <w:spacing w:before="100"/>
+        <w:rPr>
+          <w:rFonts w:ascii="Calibri" w:hAnsi="Calibri" w:cs="Calibri"/>
+          <w:b/>
+          <w:bCs/>
+          <w:i/>
+          <w:iCs/>
+          <w:color w:val="1F3864"/>
+          <w:sz w:val="16"/>
+          <w:szCs w:val="16"/>
+          <w:highlight w:val="lightGray"/>
+          <w:lang w:val="en-PK"/>
+        </w:rPr>
+      </w:pPr>
+      <w:r>
+        <w:rPr>
+          <w:rFonts w:ascii="Calibri" w:hAnsi="Calibri" w:cs="Calibri"/>
+          <w:b/>
+          <w:bCs/>
+          <w:i/>
+          <w:iCs/>
+          <w:color w:val="1F3864"/>
+          <w:sz w:val="16"/>
+          <w:szCs w:val="16"/>
+          <w:highlight w:val="lightGray"/>
+          <w:lang w:val="en-PK"/>
+        </w:rPr>
+        <w:t xml:space="preserve">                    </w:t>
+      </w:r>
+      <w:proofErr w:type="spellStart"/>
+      <w:r>
+        <w:rPr>
+          <w:rFonts w:ascii="Calibri" w:hAnsi="Calibri" w:cs="Calibri"/>
+          <w:b/>
+          <w:bCs/>
+          <w:i/>
+          <w:iCs/>
+          <w:color w:val="1F3864"/>
+          <w:sz w:val="16"/>
+          <w:szCs w:val="16"/>
+          <w:highlight w:val="lightGray"/>
+          <w:lang w:val="en-PK"/>
+        </w:rPr>
+        <w:t>lastDistanceToCheckpoint</w:t>
+      </w:r>
+      <w:proofErr w:type="spellEnd"/>
+      <w:r>
+        <w:rPr>
+          <w:rFonts w:ascii="Calibri" w:hAnsi="Calibri" w:cs="Calibri"/>
+          <w:b/>
+          <w:bCs/>
+          <w:i/>
+          <w:iCs/>
+          <w:color w:val="1F3864"/>
+          <w:sz w:val="16"/>
+          <w:szCs w:val="16"/>
+          <w:highlight w:val="lightGray"/>
+          <w:lang w:val="en-PK"/>
+        </w:rPr>
+        <w:t xml:space="preserve"> = Vector3.Distance(</w:t>
+      </w:r>
+    </w:p>
+    <w:p>
+      <w:pPr>
+        <w:spacing w:before="100"/>
+        <w:rPr>
+          <w:rFonts w:ascii="Calibri" w:hAnsi="Calibri" w:cs="Calibri"/>
+          <w:b/>
+          <w:bCs/>
+          <w:i/>
+          <w:iCs/>
+          <w:color w:val="1F3864"/>
+          <w:sz w:val="16"/>
+          <w:szCs w:val="16"/>
+          <w:highlight w:val="lightGray"/>
+          <w:lang w:val="en-PK"/>
+        </w:rPr>
+      </w:pPr>
+      <w:r>
+        <w:rPr>
+          <w:rFonts w:ascii="Calibri" w:hAnsi="Calibri" w:cs="Calibri"/>
+          <w:b/>
+          <w:bCs/>
+          <w:i/>
+          <w:iCs/>
+          <w:color w:val="1F3864"/>
+          <w:sz w:val="16"/>
+          <w:szCs w:val="16"/>
+          <w:highlight w:val="lightGray"/>
+          <w:lang w:val="en-PK"/>
+        </w:rPr>
+        <w:t xml:space="preserve">                        </w:t>
+      </w:r>
+      <w:proofErr w:type="spellStart"/>
+      <w:proofErr w:type="gramStart"/>
+      <w:r>
+        <w:rPr>
+          <w:rFonts w:ascii="Calibri" w:hAnsi="Calibri" w:cs="Calibri"/>
+          <w:b/>
+          <w:bCs/>
+          <w:i/>
+          <w:iCs/>
+          <w:color w:val="1F3864"/>
+          <w:sz w:val="16"/>
+          <w:szCs w:val="16"/>
+          <w:highlight w:val="lightGray"/>
+          <w:lang w:val="en-PK"/>
+        </w:rPr>
+        <w:t>transform.position</w:t>
+      </w:r>
+      <w:proofErr w:type="spellEnd"/>
+      <w:proofErr w:type="gramEnd"/>
+      <w:r>
+        <w:rPr>
+          <w:rFonts w:ascii="Calibri" w:hAnsi="Calibri" w:cs="Calibri"/>
+          <w:b/>
+          <w:bCs/>
+          <w:i/>
+          <w:iCs/>
+          <w:color w:val="1F3864"/>
+          <w:sz w:val="16"/>
+          <w:szCs w:val="16"/>
+          <w:highlight w:val="lightGray"/>
+          <w:lang w:val="en-PK"/>
+        </w:rPr>
+        <w:t>,</w:t>
+      </w:r>
+    </w:p>
+    <w:p>
+      <w:pPr>
+        <w:spacing w:before="100"/>
+        <w:rPr>
+          <w:rFonts w:ascii="Calibri" w:hAnsi="Calibri" w:cs="Calibri"/>
+          <w:b/>
+          <w:bCs/>
+          <w:i/>
+          <w:iCs/>
+          <w:color w:val="1F3864"/>
+          <w:sz w:val="16"/>
+          <w:szCs w:val="16"/>
+          <w:highlight w:val="lightGray"/>
+          <w:lang w:val="en-PK"/>
+        </w:rPr>
+      </w:pPr>
+      <w:r>
+        <w:rPr>
+          <w:rFonts w:ascii="Calibri" w:hAnsi="Calibri" w:cs="Calibri"/>
+          <w:b/>
+          <w:bCs/>
+          <w:i/>
+          <w:iCs/>
+          <w:color w:val="1F3864"/>
+          <w:sz w:val="16"/>
+          <w:szCs w:val="16"/>
+          <w:highlight w:val="lightGray"/>
+          <w:lang w:val="en-PK"/>
+        </w:rPr>
+        <w:t>                        checkpoints[</w:t>
+      </w:r>
+      <w:proofErr w:type="spellStart"/>
+      <w:r>
+        <w:rPr>
+          <w:rFonts w:ascii="Calibri" w:hAnsi="Calibri" w:cs="Calibri"/>
+          <w:b/>
+          <w:bCs/>
+          <w:i/>
+          <w:iCs/>
+          <w:color w:val="1F3864"/>
+          <w:sz w:val="16"/>
+          <w:szCs w:val="16"/>
+          <w:highlight w:val="lightGray"/>
+          <w:lang w:val="en-PK"/>
+        </w:rPr>
+        <w:t>currentCheckpoint</w:t>
+      </w:r>
+      <w:proofErr w:type="spellEnd"/>
+      <w:proofErr w:type="gramStart"/>
+      <w:r>
+        <w:rPr>
+          <w:rFonts w:ascii="Calibri" w:hAnsi="Calibri" w:cs="Calibri"/>
+          <w:b/>
+          <w:bCs/>
+          <w:i/>
+          <w:iCs/>
+          <w:color w:val="1F3864"/>
+          <w:sz w:val="16"/>
+          <w:szCs w:val="16"/>
+          <w:highlight w:val="lightGray"/>
+          <w:lang w:val="en-PK"/>
+        </w:rPr>
+        <w:t>].position</w:t>
+      </w:r>
+      <w:proofErr w:type="gramEnd"/>
+    </w:p>
+    <w:p>
+      <w:pPr>
+        <w:spacing w:before="100"/>
+        <w:rPr>
+          <w:rFonts w:ascii="Calibri" w:hAnsi="Calibri" w:cs="Calibri"/>
+          <w:b/>
+          <w:bCs/>
+          <w:i/>
+          <w:iCs/>
+          <w:color w:val="1F3864"/>
+          <w:sz w:val="16"/>
+          <w:szCs w:val="16"/>
+          <w:highlight w:val="lightGray"/>
+          <w:lang w:val="en-PK"/>
+        </w:rPr>
+      </w:pPr>
+      <w:r>
+        <w:rPr>
+          <w:rFonts w:ascii="Calibri" w:hAnsi="Calibri" w:cs="Calibri"/>
+          <w:b/>
+          <w:bCs/>
+          <w:i/>
+          <w:iCs/>
+          <w:color w:val="1F3864"/>
+          <w:sz w:val="16"/>
+          <w:szCs w:val="16"/>
+          <w:highlight w:val="lightGray"/>
+          <w:lang w:val="en-PK"/>
+        </w:rPr>
+        <w:t xml:space="preserve">                    </w:t>
+      </w:r>
+      <w:proofErr w:type="gramStart"/>
+      <w:r>
+        <w:rPr>
+          <w:rFonts w:ascii="Calibri" w:hAnsi="Calibri" w:cs="Calibri"/>
+          <w:b/>
+          <w:bCs/>
+          <w:i/>
+          <w:iCs/>
+          <w:color w:val="1F3864"/>
+          <w:sz w:val="16"/>
+          <w:szCs w:val="16"/>
+          <w:highlight w:val="lightGray"/>
+          <w:lang w:val="en-PK"/>
+        </w:rPr>
+        <w:t>);</w:t>
+      </w:r>
+      <w:proofErr w:type="gramEnd"/>
+    </w:p>
+    <w:p>
+      <w:pPr>
+        <w:spacing w:before="100"/>
+        <w:rPr>
+          <w:rFonts w:ascii="Calibri" w:hAnsi="Calibri" w:cs="Calibri"/>
+          <w:b/>
+          <w:bCs/>
+          <w:i/>
+          <w:iCs/>
+          <w:color w:val="1F3864"/>
+          <w:sz w:val="16"/>
+          <w:szCs w:val="16"/>
+          <w:highlight w:val="lightGray"/>
+          <w:lang w:val="en-PK"/>
+        </w:rPr>
+      </w:pPr>
+      <w:r>
+        <w:rPr>
+          <w:rFonts w:ascii="Calibri" w:hAnsi="Calibri" w:cs="Calibri"/>
+          <w:b/>
+          <w:bCs/>
+          <w:i/>
+          <w:iCs/>
+          <w:color w:val="1F3864"/>
+          <w:sz w:val="16"/>
+          <w:szCs w:val="16"/>
+          <w:highlight w:val="lightGray"/>
+          <w:lang w:val="en-PK"/>
+        </w:rPr>
+        <w:t>                }</w:t>
+      </w:r>
+    </w:p>
+    <w:p>
+      <w:pPr>
+        <w:spacing w:before="100"/>
+        <w:rPr>
+          <w:rFonts w:ascii="Calibri" w:hAnsi="Calibri" w:cs="Calibri"/>
+          <w:b/>
+          <w:bCs/>
+          <w:i/>
+          <w:iCs/>
+          <w:color w:val="1F3864"/>
+          <w:sz w:val="16"/>
+          <w:szCs w:val="16"/>
+          <w:highlight w:val="lightGray"/>
+          <w:lang w:val="en-PK"/>
+        </w:rPr>
+      </w:pPr>
+      <w:r>
+        <w:rPr>
+          <w:rFonts w:ascii="Calibri" w:hAnsi="Calibri" w:cs="Calibri"/>
+          <w:b/>
+          <w:bCs/>
+          <w:i/>
+          <w:iCs/>
+          <w:color w:val="1F3864"/>
+          <w:sz w:val="16"/>
+          <w:szCs w:val="16"/>
+          <w:highlight w:val="lightGray"/>
+          <w:lang w:val="en-PK"/>
+        </w:rPr>
+        <w:t>            }</w:t>
+      </w:r>
+    </w:p>
+    <w:p>
+      <w:pPr>
+        <w:spacing w:before="100"/>
+        <w:rPr>
+          <w:rFonts w:ascii="Calibri" w:hAnsi="Calibri" w:cs="Calibri"/>
+          <w:b/>
+          <w:bCs/>
+          <w:i/>
+          <w:iCs/>
+          <w:color w:val="1F3864"/>
+          <w:sz w:val="16"/>
+          <w:szCs w:val="16"/>
+          <w:highlight w:val="lightGray"/>
+          <w:lang w:val="en-PK"/>
+        </w:rPr>
+      </w:pPr>
+      <w:r>
+        <w:rPr>
+          <w:rFonts w:ascii="Calibri" w:hAnsi="Calibri" w:cs="Calibri"/>
+          <w:b/>
+          <w:bCs/>
+          <w:i/>
+          <w:iCs/>
+          <w:color w:val="1F3864"/>
+          <w:sz w:val="16"/>
+          <w:szCs w:val="16"/>
+          <w:highlight w:val="lightGray"/>
+          <w:lang w:val="en-PK"/>
+        </w:rPr>
+        <w:t>        }</w:t>
+      </w:r>
+    </w:p>
+    <w:p>
+      <w:pPr>
+        <w:spacing w:before="100"/>
+        <w:rPr>
+          <w:rFonts w:ascii="Calibri" w:hAnsi="Calibri" w:cs="Calibri"/>
+          <w:b/>
+          <w:bCs/>
+          <w:i/>
+          <w:iCs/>
+          <w:color w:val="1F3864"/>
+          <w:sz w:val="16"/>
+          <w:szCs w:val="16"/>
+          <w:highlight w:val="lightGray"/>
+          <w:lang w:val="en-PK"/>
+        </w:rPr>
+      </w:pPr>
+    </w:p>
+    <w:p>
+      <w:pPr>
+        <w:spacing w:before="100"/>
+        <w:rPr>
+          <w:rFonts w:ascii="Calibri" w:hAnsi="Calibri" w:cs="Calibri"/>
+          <w:b/>
+          <w:bCs/>
+          <w:i/>
+          <w:iCs/>
+          <w:color w:val="1F3864"/>
+          <w:sz w:val="16"/>
+          <w:szCs w:val="16"/>
+          <w:highlight w:val="lightGray"/>
+          <w:lang w:val="en-PK"/>
+        </w:rPr>
+      </w:pPr>
+      <w:r>
+        <w:rPr>
+          <w:rFonts w:ascii="Calibri" w:hAnsi="Calibri" w:cs="Calibri"/>
+          <w:b/>
+          <w:bCs/>
+          <w:i/>
+          <w:iCs/>
+          <w:color w:val="1F3864"/>
+          <w:sz w:val="16"/>
+          <w:szCs w:val="16"/>
+          <w:highlight w:val="lightGray"/>
+          <w:lang w:val="en-PK"/>
+        </w:rPr>
+        <w:t xml:space="preserve">        // Track se bahar </w:t>
+      </w:r>
+      <w:proofErr w:type="spellStart"/>
+      <w:r>
+        <w:rPr>
+          <w:rFonts w:ascii="Calibri" w:hAnsi="Calibri" w:cs="Calibri"/>
+          <w:b/>
+          <w:bCs/>
+          <w:i/>
+          <w:iCs/>
+          <w:color w:val="1F3864"/>
+          <w:sz w:val="16"/>
+          <w:szCs w:val="16"/>
+          <w:highlight w:val="lightGray"/>
+          <w:lang w:val="en-PK"/>
+        </w:rPr>
+        <w:t>gaya</w:t>
+      </w:r>
+      <w:proofErr w:type="spellEnd"/>
+    </w:p>
+    <w:p>
+      <w:pPr>
+        <w:spacing w:before="100"/>
+        <w:rPr>
+          <w:rFonts w:ascii="Calibri" w:hAnsi="Calibri" w:cs="Calibri"/>
+          <w:b/>
+          <w:bCs/>
+          <w:i/>
+          <w:iCs/>
+          <w:color w:val="1F3864"/>
+          <w:sz w:val="16"/>
+          <w:szCs w:val="16"/>
+          <w:highlight w:val="lightGray"/>
+          <w:lang w:val="en-PK"/>
+        </w:rPr>
+      </w:pPr>
+      <w:r>
+        <w:rPr>
+          <w:rFonts w:ascii="Calibri" w:hAnsi="Calibri" w:cs="Calibri"/>
+          <w:b/>
+          <w:bCs/>
+          <w:i/>
+          <w:iCs/>
+          <w:color w:val="1F3864"/>
+          <w:sz w:val="16"/>
+          <w:szCs w:val="16"/>
+          <w:highlight w:val="lightGray"/>
+          <w:lang w:val="en-PK"/>
+        </w:rPr>
+        <w:t>       /* if (</w:t>
+      </w:r>
+      <w:proofErr w:type="spellStart"/>
+      <w:proofErr w:type="gramStart"/>
+      <w:r>
+        <w:rPr>
+          <w:rFonts w:ascii="Calibri" w:hAnsi="Calibri" w:cs="Calibri"/>
+          <w:b/>
+          <w:bCs/>
+          <w:i/>
+          <w:iCs/>
+          <w:color w:val="1F3864"/>
+          <w:sz w:val="16"/>
+          <w:szCs w:val="16"/>
+          <w:highlight w:val="lightGray"/>
+          <w:lang w:val="en-PK"/>
+        </w:rPr>
+        <w:t>other.CompareTag</w:t>
+      </w:r>
+      <w:proofErr w:type="spellEnd"/>
+      <w:proofErr w:type="gramEnd"/>
+      <w:r>
+        <w:rPr>
+          <w:rFonts w:ascii="Calibri" w:hAnsi="Calibri" w:cs="Calibri"/>
+          <w:b/>
+          <w:bCs/>
+          <w:i/>
+          <w:iCs/>
+          <w:color w:val="1F3864"/>
+          <w:sz w:val="16"/>
+          <w:szCs w:val="16"/>
+          <w:highlight w:val="lightGray"/>
+          <w:lang w:val="en-PK"/>
+        </w:rPr>
+        <w:t>("</w:t>
+      </w:r>
+      <w:proofErr w:type="spellStart"/>
+      <w:r>
+        <w:rPr>
+          <w:rFonts w:ascii="Calibri" w:hAnsi="Calibri" w:cs="Calibri"/>
+          <w:b/>
+          <w:bCs/>
+          <w:i/>
+          <w:iCs/>
+          <w:color w:val="1F3864"/>
+          <w:sz w:val="16"/>
+          <w:szCs w:val="16"/>
+          <w:highlight w:val="lightGray"/>
+          <w:lang w:val="en-PK"/>
+        </w:rPr>
+        <w:t>OutOfBounds</w:t>
+      </w:r>
+      <w:proofErr w:type="spellEnd"/>
+      <w:r>
+        <w:rPr>
+          <w:rFonts w:ascii="Calibri" w:hAnsi="Calibri" w:cs="Calibri"/>
+          <w:b/>
+          <w:bCs/>
+          <w:i/>
+          <w:iCs/>
+          <w:color w:val="1F3864"/>
+          <w:sz w:val="16"/>
+          <w:szCs w:val="16"/>
+          <w:highlight w:val="lightGray"/>
+          <w:lang w:val="en-PK"/>
+        </w:rPr>
+        <w:t>"))</w:t>
+      </w:r>
+    </w:p>
+    <w:p>
+      <w:pPr>
+        <w:spacing w:before="100"/>
+        <w:rPr>
+          <w:rFonts w:ascii="Calibri" w:hAnsi="Calibri" w:cs="Calibri"/>
+          <w:b/>
+          <w:bCs/>
+          <w:i/>
+          <w:iCs/>
+          <w:color w:val="1F3864"/>
+          <w:sz w:val="16"/>
+          <w:szCs w:val="16"/>
+          <w:highlight w:val="lightGray"/>
+          <w:lang w:val="en-PK"/>
+        </w:rPr>
+      </w:pPr>
+      <w:r>
+        <w:rPr>
+          <w:rFonts w:ascii="Calibri" w:hAnsi="Calibri" w:cs="Calibri"/>
+          <w:b/>
+          <w:bCs/>
+          <w:i/>
+          <w:iCs/>
+          <w:color w:val="1F3864"/>
+          <w:sz w:val="16"/>
+          <w:szCs w:val="16"/>
+          <w:highlight w:val="lightGray"/>
+          <w:lang w:val="en-PK"/>
+        </w:rPr>
+        <w:t>        {</w:t>
+      </w:r>
+    </w:p>
+    <w:p>
+      <w:pPr>
+        <w:spacing w:before="100"/>
+        <w:rPr>
+          <w:rFonts w:ascii="Calibri" w:hAnsi="Calibri" w:cs="Calibri"/>
+          <w:b/>
+          <w:bCs/>
+          <w:i/>
+          <w:iCs/>
+          <w:color w:val="1F3864"/>
+          <w:sz w:val="16"/>
+          <w:szCs w:val="16"/>
+          <w:highlight w:val="lightGray"/>
+          <w:lang w:val="en-PK"/>
+        </w:rPr>
+      </w:pPr>
+      <w:r>
+        <w:rPr>
+          <w:rFonts w:ascii="Calibri" w:hAnsi="Calibri" w:cs="Calibri"/>
+          <w:b/>
+          <w:bCs/>
+          <w:i/>
+          <w:iCs/>
+          <w:color w:val="1F3864"/>
+          <w:sz w:val="16"/>
+          <w:szCs w:val="16"/>
+          <w:highlight w:val="lightGray"/>
+          <w:lang w:val="en-PK"/>
+        </w:rPr>
+        <w:t xml:space="preserve">            </w:t>
+      </w:r>
+      <w:proofErr w:type="spellStart"/>
+      <w:r>
+        <w:rPr>
+          <w:rFonts w:ascii="Calibri" w:hAnsi="Calibri" w:cs="Calibri"/>
+          <w:b/>
+          <w:bCs/>
+          <w:i/>
+          <w:iCs/>
+          <w:color w:val="1F3864"/>
+          <w:sz w:val="16"/>
+          <w:szCs w:val="16"/>
+          <w:highlight w:val="lightGray"/>
+          <w:lang w:val="en-PK"/>
+        </w:rPr>
+        <w:t>AddReward</w:t>
+      </w:r>
+      <w:proofErr w:type="spellEnd"/>
+      <w:r>
+        <w:rPr>
+          <w:rFonts w:ascii="Calibri" w:hAnsi="Calibri" w:cs="Calibri"/>
+          <w:b/>
+          <w:bCs/>
+          <w:i/>
+          <w:iCs/>
+          <w:color w:val="1F3864"/>
+          <w:sz w:val="16"/>
+          <w:szCs w:val="16"/>
+          <w:highlight w:val="lightGray"/>
+          <w:lang w:val="en-PK"/>
+        </w:rPr>
+        <w:t>(-2.0f</w:t>
+      </w:r>
+      <w:proofErr w:type="gramStart"/>
+      <w:r>
+        <w:rPr>
+          <w:rFonts w:ascii="Calibri" w:hAnsi="Calibri" w:cs="Calibri"/>
+          <w:b/>
+          <w:bCs/>
+          <w:i/>
+          <w:iCs/>
+          <w:color w:val="1F3864"/>
+          <w:sz w:val="16"/>
+          <w:szCs w:val="16"/>
+          <w:highlight w:val="lightGray"/>
+          <w:lang w:val="en-PK"/>
+        </w:rPr>
+        <w:t>);</w:t>
+      </w:r>
+      <w:proofErr w:type="gramEnd"/>
+    </w:p>
+    <w:p>
+      <w:pPr>
+        <w:spacing w:before="100"/>
+        <w:rPr>
+          <w:rFonts w:ascii="Calibri" w:hAnsi="Calibri" w:cs="Calibri"/>
+          <w:b/>
+          <w:bCs/>
+          <w:i/>
+          <w:iCs/>
+          <w:color w:val="1F3864"/>
+          <w:sz w:val="16"/>
+          <w:szCs w:val="16"/>
+          <w:highlight w:val="lightGray"/>
+          <w:lang w:val="en-PK"/>
+        </w:rPr>
+      </w:pPr>
+      <w:r>
+        <w:rPr>
+          <w:rFonts w:ascii="Calibri" w:hAnsi="Calibri" w:cs="Calibri"/>
+          <w:b/>
+          <w:bCs/>
+          <w:i/>
+          <w:iCs/>
+          <w:color w:val="1F3864"/>
+          <w:sz w:val="16"/>
+          <w:szCs w:val="16"/>
+          <w:highlight w:val="lightGray"/>
+          <w:lang w:val="en-PK"/>
+        </w:rPr>
+        <w:t xml:space="preserve">            </w:t>
+      </w:r>
+      <w:proofErr w:type="spellStart"/>
+      <w:proofErr w:type="gramStart"/>
+      <w:r>
+        <w:rPr>
+          <w:rFonts w:ascii="Calibri" w:hAnsi="Calibri" w:cs="Calibri"/>
+          <w:b/>
+          <w:bCs/>
+          <w:i/>
+          <w:iCs/>
+          <w:color w:val="1F3864"/>
+          <w:sz w:val="16"/>
+          <w:szCs w:val="16"/>
+          <w:highlight w:val="lightGray"/>
+          <w:lang w:val="en-PK"/>
+        </w:rPr>
+        <w:t>EndEpisode</w:t>
+      </w:r>
+      <w:proofErr w:type="spellEnd"/>
+      <w:r>
+        <w:rPr>
+          <w:rFonts w:ascii="Calibri" w:hAnsi="Calibri" w:cs="Calibri"/>
+          <w:b/>
+          <w:bCs/>
+          <w:i/>
+          <w:iCs/>
+          <w:color w:val="1F3864"/>
+          <w:sz w:val="16"/>
+          <w:szCs w:val="16"/>
+          <w:highlight w:val="lightGray"/>
+          <w:lang w:val="en-PK"/>
+        </w:rPr>
+        <w:t>();</w:t>
+      </w:r>
+      <w:proofErr w:type="gramEnd"/>
+    </w:p>
+    <w:p>
+      <w:pPr>
+        <w:spacing w:before="100"/>
+        <w:rPr>
+          <w:rFonts w:ascii="Calibri" w:hAnsi="Calibri" w:cs="Calibri"/>
+          <w:b/>
+          <w:bCs/>
+          <w:i/>
+          <w:iCs/>
+          <w:color w:val="1F3864"/>
+          <w:sz w:val="16"/>
+          <w:szCs w:val="16"/>
+          <w:lang w:val="en-PK"/>
+        </w:rPr>
+      </w:pPr>
+      <w:r>
+        <w:rPr>
+          <w:rFonts w:ascii="Calibri" w:hAnsi="Calibri" w:cs="Calibri"/>
+          <w:b/>
+          <w:bCs/>
+          <w:i/>
+          <w:iCs/>
+          <w:color w:val="1F3864"/>
+          <w:sz w:val="16"/>
+          <w:szCs w:val="16"/>
+          <w:highlight w:val="lightGray"/>
+          <w:lang w:val="en-PK"/>
+        </w:rPr>
+        <w:t>        }*/</w:t>
       </w:r>
     </w:p>
     <w:p>
@@ -13059,7 +15374,7 @@
                     <pic:cNvPicPr/>
                   </pic:nvPicPr>
                   <pic:blipFill>
-                    <a:blip r:embed="rId15" cstate="print">
+                    <a:blip r:embed="rId16" cstate="print">
                       <a:extLst>
                         <a:ext uri="{28A0092B-C50C-407E-A947-70E740481C1C}">
                           <a14:useLocalDpi xmlns:a14="http://schemas.microsoft.com/office/drawing/2010/main" val="0"/>
@@ -13151,8 +15466,22 @@
                 <w:sz w:val="21"/>
                 <w:szCs w:val="21"/>
               </w:rPr>
-              <w:t>[ INSERT: Screenshot of GitHub repository commit history showing iterative development with descriptive commit messages ]</w:t>
-            </w:r>
+              <w:t xml:space="preserve">[ INSERT: Screenshot of GitHub repository commit history showing iterative development with descriptive commit </w:t>
+            </w:r>
+            <w:proofErr w:type="gramStart"/>
+            <w:r>
+              <w:rPr>
+                <w:b/>
+                <w:bCs/>
+                <w:i/>
+                <w:iCs/>
+                <w:color w:val="2E75B6"/>
+                <w:sz w:val="21"/>
+                <w:szCs w:val="21"/>
+              </w:rPr>
+              <w:t>messages ]</w:t>
+            </w:r>
+            <w:proofErr w:type="gramEnd"/>
           </w:p>
         </w:tc>
       </w:tr>
@@ -13178,8 +15507,8 @@
       </w:r>
     </w:p>
     <w:sectPr>
-      <w:headerReference w:type="default" r:id="rId16"/>
-      <w:footerReference w:type="default" r:id="rId17"/>
+      <w:headerReference w:type="default" r:id="rId17"/>
+      <w:footerReference w:type="default" r:id="rId18"/>
       <w:pgSz w:w="11906" w:h="16838"/>
       <w:pgMar w:top="1440" w:right="1260" w:bottom="1440" w:left="1260" w:header="708" w:footer="708" w:gutter="0"/>
       <w:cols w:space="720"/>
@@ -14557,7 +16886,6 @@
   <w:style w:type="character" w:default="1" w:styleId="DefaultParagraphFont">
     <w:name w:val="Default Paragraph Font"/>
     <w:uiPriority w:val="1"/>
-    <w:semiHidden/>
     <w:unhideWhenUsed/>
   </w:style>
   <w:style w:type="table" w:default="1" w:styleId="TableNormal">
@@ -14746,6 +17074,21 @@
       <w:shd w:val="clear" w:color="auto" w:fill="E1DFDD"/>
     </w:rPr>
   </w:style>
+  <w:style w:type="paragraph" w:customStyle="1" w:styleId="msonormal0">
+    <w:name w:val="msonormal"/>
+    <w:basedOn w:val="Normal"/>
+    <w:rsid w:val="00271560"/>
+    <w:pPr>
+      <w:spacing w:before="100" w:beforeAutospacing="1" w:after="100" w:afterAutospacing="1"/>
+    </w:pPr>
+    <w:rPr>
+      <w:rFonts w:ascii="Times New Roman" w:eastAsia="Times New Roman" w:hAnsi="Times New Roman" w:cs="Times New Roman"/>
+      <w:color w:val="auto"/>
+      <w:sz w:val="24"/>
+      <w:szCs w:val="24"/>
+      <w:lang w:val="en-PK" w:eastAsia="en-PK"/>
+    </w:rPr>
+  </w:style>
 </w:styles>
 </file>
 
@@ -14829,6 +17172,13 @@
     <w:pitch w:val="variable"/>
     <w:sig w:usb0="E00006FF" w:usb1="420024FF" w:usb2="02000000" w:usb3="00000000" w:csb0="0000019F" w:csb1="00000000"/>
   </w:font>
+  <w:font w:name="Calibri">
+    <w:panose1 w:val="020F0502020204030204"/>
+    <w:charset w:val="00"/>
+    <w:family w:val="swiss"/>
+    <w:pitch w:val="variable"/>
+    <w:sig w:usb0="E4002EFF" w:usb1="C200247B" w:usb2="00000009" w:usb3="00000000" w:csb0="000001FF" w:csb1="00000000"/>
+  </w:font>
   <w:font w:name="Aptos Display">
     <w:charset w:val="00"/>
     <w:family w:val="swiss"/>
@@ -14862,7 +17212,7 @@
     <w:rsidRoot w:val="00850A12"/>
     <w:rsid w:val="002F6C15"/>
     <w:rsid w:val="0037025C"/>
-    <w:rsid w:val="004853C9"/>
+    <w:rsid w:val="0040468A"/>
     <w:rsid w:val="004E5B80"/>
     <w:rsid w:val="00536504"/>
     <w:rsid w:val="005E4781"/>

</xml_diff>

<commit_message>
GIT LOG DOWNLOADED AND ADDED
</commit_message>
<xml_diff>
--- a/IPR_Rana_Zeeshan_Ali_24000292.docx
+++ b/IPR_Rana_Zeeshan_Ali_24000292.docx
@@ -9950,7 +9950,7 @@
           <w:sz w:val="20"/>
           <w:szCs w:val="20"/>
         </w:rPr>
-        <w:t>Figure 3. Gantt chart showing the 8-week project timeline. Each row represents one task; filled squares indicate the scheduled active week. Colour coding corresponds to project phase.</w:t>
+        <w:t xml:space="preserve"> Gantt chart showing the 8-week project timeline. Each row represents one task; filled squares indicate the scheduled active week. Colour coding corresponds to project phase.</w:t>
       </w:r>
     </w:p>
     <w:p>
@@ -10355,23 +10355,7 @@
                 <w:sz w:val="20"/>
                 <w:szCs w:val="20"/>
               </w:rPr>
-              <w:t xml:space="preserve">All </w:t>
-            </w:r>
-            <w:proofErr w:type="gramStart"/>
-            <w:r>
-              <w:rPr>
-                <w:sz w:val="20"/>
-                <w:szCs w:val="20"/>
-              </w:rPr>
-              <w:t>three algorithm</w:t>
-            </w:r>
-            <w:proofErr w:type="gramEnd"/>
-            <w:r>
-              <w:rPr>
-                <w:sz w:val="20"/>
-                <w:szCs w:val="20"/>
-              </w:rPr>
-              <w:t xml:space="preserve"> training complete</w:t>
+              <w:t>All three algorithm training complete</w:t>
             </w:r>
           </w:p>
         </w:tc>
@@ -12807,7 +12791,7 @@
           <w:sz w:val="19"/>
           <w:szCs w:val="19"/>
         </w:rPr>
-        <w:t xml:space="preserve">Figure A1. Training Environment — dynamic arena with randomised obstacle placement and randomised target positions. The Testing </w:t>
+        <w:t xml:space="preserve">Figure A. Training Environment — dynamic arena with randomised obstacle placement and randomised target positions. The Testing </w:t>
       </w:r>
       <w:r>
         <w:rPr>
@@ -12844,7 +12828,43 @@
       <w:pPr>
         <w:pStyle w:val="Heading2"/>
       </w:pPr>
-      <w:r>
+    </w:p>
+    <w:p>
+      <w:pPr>
+        <w:pStyle w:val="Heading2"/>
+      </w:pPr>
+    </w:p>
+    <w:p>
+      <w:pPr>
+        <w:pStyle w:val="Heading2"/>
+      </w:pPr>
+    </w:p>
+    <w:p>
+      <w:pPr>
+        <w:pStyle w:val="Heading2"/>
+      </w:pPr>
+    </w:p>
+    <w:p>
+      <w:pPr>
+        <w:pStyle w:val="Heading2"/>
+      </w:pPr>
+    </w:p>
+    <w:p>
+      <w:pPr>
+        <w:pStyle w:val="Heading2"/>
+      </w:pPr>
+    </w:p>
+    <w:p>
+      <w:pPr>
+        <w:pStyle w:val="Heading2"/>
+      </w:pPr>
+    </w:p>
+    <w:p>
+      <w:pPr>
+        <w:pStyle w:val="Heading2"/>
+      </w:pPr>
+      <w:r>
+        <w:lastRenderedPageBreak/>
         <w:t>Appendix B: SAC Initial Training Output</w:t>
       </w:r>
     </w:p>
@@ -12856,7 +12876,6 @@
         <w:rPr>
           <w:noProof/>
         </w:rPr>
-        <w:lastRenderedPageBreak/>
         <w:drawing>
           <wp:inline distT="0" distB="0" distL="0" distR="0" wp14:anchorId="5970CB9E" wp14:editId="36CF3E39">
             <wp:extent cx="5297664" cy="3539490"/>
@@ -12941,16 +12960,6 @@
     </w:p>
     <w:p>
       <w:pPr>
-        <w:spacing w:before="100"/>
-      </w:pPr>
-    </w:p>
-    <w:p>
-      <w:pPr>
-        <w:pStyle w:val="Heading2"/>
-      </w:pPr>
-    </w:p>
-    <w:p>
-      <w:pPr>
         <w:pStyle w:val="Heading2"/>
       </w:pPr>
     </w:p>
@@ -13041,8 +13050,7 @@
           <w:sz w:val="19"/>
           <w:szCs w:val="19"/>
         </w:rPr>
-        <w:lastRenderedPageBreak/>
-        <w:t xml:space="preserve">Figure C1. DQN Q-network architecture implemented in PyTorch. Input layer: 14 observations (12 </w:t>
+        <w:t xml:space="preserve">Figure C. DQN Q-network architecture implemented in PyTorch. Input layer: 14 observations (12 </w:t>
       </w:r>
       <w:proofErr w:type="spellStart"/>
       <w:r>
@@ -13099,7 +13107,18 @@
         <w:pStyle w:val="Heading2"/>
       </w:pPr>
       <w:r>
-        <w:t>Appendix D: Code Snippets</w:t>
+        <w:t xml:space="preserve">Appendix D: Code </w:t>
+      </w:r>
+      <w:proofErr w:type="gramStart"/>
+      <w:r>
+        <w:t>Snippets</w:t>
+      </w:r>
+      <w:r>
+        <w:t>(</w:t>
+      </w:r>
+      <w:proofErr w:type="gramEnd"/>
+      <w:r>
+        <w:t>Reward Function)</w:t>
       </w:r>
     </w:p>
     <w:p>
@@ -15312,7 +15331,27 @@
           <w:sz w:val="23"/>
           <w:szCs w:val="23"/>
         </w:rPr>
-        <w:t>D.3 SAC Training Configuration File (.</w:t>
+        <w:t>D.</w:t>
+      </w:r>
+      <w:r>
+        <w:rPr>
+          <w:b/>
+          <w:bCs/>
+          <w:color w:val="1F3864"/>
+          <w:sz w:val="23"/>
+          <w:szCs w:val="23"/>
+        </w:rPr>
+        <w:t>2</w:t>
+      </w:r>
+      <w:r>
+        <w:rPr>
+          <w:b/>
+          <w:bCs/>
+          <w:color w:val="1F3864"/>
+          <w:sz w:val="23"/>
+          <w:szCs w:val="23"/>
+        </w:rPr>
+        <w:t xml:space="preserve"> SAC Training Configuration File (.</w:t>
       </w:r>
       <w:proofErr w:type="spellStart"/>
       <w:r>
@@ -15404,95 +15443,12 @@
     <w:p>
       <w:pPr>
         <w:spacing w:before="100"/>
-      </w:pPr>
-    </w:p>
-    <w:p>
-      <w:pPr>
-        <w:pStyle w:val="Heading2"/>
-      </w:pPr>
-      <w:r>
-        <w:t>Appendix E: Git Commit History</w:t>
-      </w:r>
-    </w:p>
-    <w:tbl>
-      <w:tblPr>
-        <w:tblW w:w="9026" w:type="dxa"/>
-        <w:tblBorders>
-          <w:top w:val="single" w:sz="4" w:space="0" w:color="auto"/>
-          <w:left w:val="single" w:sz="4" w:space="0" w:color="auto"/>
-          <w:bottom w:val="single" w:sz="4" w:space="0" w:color="auto"/>
-          <w:right w:val="single" w:sz="4" w:space="0" w:color="auto"/>
-          <w:insideH w:val="single" w:sz="4" w:space="0" w:color="auto"/>
-          <w:insideV w:val="single" w:sz="4" w:space="0" w:color="auto"/>
-        </w:tblBorders>
-        <w:tblCellMar>
-          <w:left w:w="10" w:type="dxa"/>
-          <w:right w:w="10" w:type="dxa"/>
-        </w:tblCellMar>
-        <w:tblLook w:val="0000" w:firstRow="0" w:lastRow="0" w:firstColumn="0" w:lastColumn="0" w:noHBand="0" w:noVBand="0"/>
-      </w:tblPr>
-      <w:tblGrid>
-        <w:gridCol w:w="9026"/>
-      </w:tblGrid>
-      <w:tr>
-        <w:tc>
-          <w:tcPr>
-            <w:tcW w:w="0" w:type="auto"/>
-            <w:tcBorders>
-              <w:top w:val="single" w:sz="2" w:space="0" w:color="2E75B6"/>
-              <w:left w:val="single" w:sz="2" w:space="0" w:color="2E75B6"/>
-              <w:bottom w:val="single" w:sz="2" w:space="0" w:color="2E75B6"/>
-              <w:right w:val="single" w:sz="2" w:space="0" w:color="2E75B6"/>
-            </w:tcBorders>
-            <w:shd w:val="clear" w:color="auto" w:fill="EAF0F8"/>
-            <w:tcMar>
-              <w:top w:w="500" w:type="dxa"/>
-              <w:left w:w="400" w:type="dxa"/>
-              <w:bottom w:w="500" w:type="dxa"/>
-              <w:right w:w="400" w:type="dxa"/>
-            </w:tcMar>
-          </w:tcPr>
-          <w:p>
-            <w:pPr>
-              <w:jc w:val="center"/>
-            </w:pPr>
-            <w:r>
-              <w:rPr>
-                <w:b/>
-                <w:bCs/>
-                <w:i/>
-                <w:iCs/>
-                <w:color w:val="2E75B6"/>
-                <w:sz w:val="21"/>
-                <w:szCs w:val="21"/>
-              </w:rPr>
-              <w:t xml:space="preserve">[ INSERT: Screenshot of GitHub repository commit history showing iterative development with descriptive commit </w:t>
-            </w:r>
-            <w:proofErr w:type="gramStart"/>
-            <w:r>
-              <w:rPr>
-                <w:b/>
-                <w:bCs/>
-                <w:i/>
-                <w:iCs/>
-                <w:color w:val="2E75B6"/>
-                <w:sz w:val="21"/>
-                <w:szCs w:val="21"/>
-              </w:rPr>
-              <w:t>messages ]</w:t>
-            </w:r>
-            <w:proofErr w:type="gramEnd"/>
-          </w:p>
-        </w:tc>
-      </w:tr>
-    </w:tbl>
-    <w:p>
-      <w:pPr>
-        <w:spacing w:before="60" w:after="160"/>
-        <w:jc w:val="center"/>
-        <w:rPr>
-          <w:sz w:val="20"/>
-          <w:szCs w:val="20"/>
+        <w:rPr>
+          <w:b/>
+          <w:bCs/>
+          <w:color w:val="1F3864"/>
+          <w:sz w:val="23"/>
+          <w:szCs w:val="23"/>
         </w:rPr>
       </w:pPr>
       <w:r>
@@ -15503,12 +15459,148 @@
           <w:sz w:val="20"/>
           <w:szCs w:val="20"/>
         </w:rPr>
-        <w:t>Figure E1. Git commit log demonstrating iterative, version-controlled development</w:t>
+        <w:t xml:space="preserve">                     </w:t>
+      </w:r>
+      <w:r>
+        <w:rPr>
+          <w:i/>
+          <w:iCs/>
+          <w:color w:val="777777"/>
+          <w:sz w:val="20"/>
+          <w:szCs w:val="20"/>
+        </w:rPr>
+        <w:t xml:space="preserve">Figure </w:t>
+      </w:r>
+      <w:r>
+        <w:rPr>
+          <w:i/>
+          <w:iCs/>
+          <w:color w:val="777777"/>
+          <w:sz w:val="20"/>
+          <w:szCs w:val="20"/>
+        </w:rPr>
+        <w:t>D2</w:t>
+      </w:r>
+      <w:r>
+        <w:rPr>
+          <w:i/>
+          <w:iCs/>
+          <w:color w:val="777777"/>
+          <w:sz w:val="20"/>
+          <w:szCs w:val="20"/>
+        </w:rPr>
+        <w:t xml:space="preserve">. </w:t>
+      </w:r>
+      <w:r>
+        <w:rPr>
+          <w:i/>
+          <w:iCs/>
+          <w:color w:val="777777"/>
+          <w:sz w:val="20"/>
+          <w:szCs w:val="20"/>
+        </w:rPr>
+        <w:t xml:space="preserve">SAC Training </w:t>
+      </w:r>
+    </w:p>
+    <w:p>
+      <w:pPr>
+        <w:spacing w:before="100"/>
+        <w:rPr>
+          <w:b/>
+          <w:bCs/>
+          <w:color w:val="1F3864"/>
+          <w:sz w:val="23"/>
+          <w:szCs w:val="23"/>
+        </w:rPr>
+      </w:pPr>
+    </w:p>
+    <w:p>
+      <w:pPr>
+        <w:spacing w:before="100"/>
+      </w:pPr>
+    </w:p>
+    <w:p>
+      <w:pPr>
+        <w:pStyle w:val="Heading2"/>
+      </w:pPr>
+      <w:r>
+        <w:t>Appendix E: Git Commit History</w:t>
+      </w:r>
+    </w:p>
+    <w:p>
+      <w:pPr>
+        <w:spacing w:before="60" w:after="160"/>
+        <w:jc w:val="center"/>
+        <w:rPr>
+          <w:sz w:val="20"/>
+          <w:szCs w:val="20"/>
+        </w:rPr>
+      </w:pPr>
+      <w:r>
+        <w:rPr>
+          <w:i/>
+          <w:iCs/>
+          <w:noProof/>
+          <w:color w:val="777777"/>
+          <w:sz w:val="20"/>
+          <w:szCs w:val="20"/>
+        </w:rPr>
+        <w:drawing>
+          <wp:inline distT="0" distB="0" distL="0" distR="0" wp14:anchorId="5222745F" wp14:editId="1B1B4BD4">
+            <wp:extent cx="6027420" cy="2411353"/>
+            <wp:effectExtent l="0" t="0" r="0" b="8255"/>
+            <wp:docPr id="123263598" name="Picture 5"/>
+            <wp:cNvGraphicFramePr>
+              <a:graphicFrameLocks xmlns:a="http://schemas.openxmlformats.org/drawingml/2006/main" noChangeAspect="1"/>
+            </wp:cNvGraphicFramePr>
+            <a:graphic xmlns:a="http://schemas.openxmlformats.org/drawingml/2006/main">
+              <a:graphicData uri="http://schemas.openxmlformats.org/drawingml/2006/picture">
+                <pic:pic xmlns:pic="http://schemas.openxmlformats.org/drawingml/2006/picture">
+                  <pic:nvPicPr>
+                    <pic:cNvPr id="123263598" name="Picture 123263598"/>
+                    <pic:cNvPicPr/>
+                  </pic:nvPicPr>
+                  <pic:blipFill>
+                    <a:blip r:embed="rId17" cstate="print">
+                      <a:extLst>
+                        <a:ext uri="{28A0092B-C50C-407E-A947-70E740481C1C}">
+                          <a14:useLocalDpi xmlns:a14="http://schemas.microsoft.com/office/drawing/2010/main" val="0"/>
+                        </a:ext>
+                      </a:extLst>
+                    </a:blip>
+                    <a:stretch>
+                      <a:fillRect/>
+                    </a:stretch>
+                  </pic:blipFill>
+                  <pic:spPr>
+                    <a:xfrm>
+                      <a:off x="0" y="0"/>
+                      <a:ext cx="6033742" cy="2413882"/>
+                    </a:xfrm>
+                    <a:prstGeom prst="rect">
+                      <a:avLst/>
+                    </a:prstGeom>
+                  </pic:spPr>
+                </pic:pic>
+              </a:graphicData>
+            </a:graphic>
+          </wp:inline>
+        </w:drawing>
+      </w:r>
+      <w:r>
+        <w:rPr>
+          <w:i/>
+          <w:iCs/>
+          <w:color w:val="777777"/>
+          <w:sz w:val="20"/>
+          <w:szCs w:val="20"/>
+        </w:rPr>
+        <w:t>Figure E. Git commit log demonstrating iterative, version-controlled development</w:t>
       </w:r>
     </w:p>
     <w:sectPr>
-      <w:headerReference w:type="default" r:id="rId17"/>
-      <w:footerReference w:type="default" r:id="rId18"/>
+      <w:headerReference w:type="default" r:id="rId18"/>
+      <w:footerReference w:type="default" r:id="rId19"/>
       <w:pgSz w:w="11906" w:h="16838"/>
       <w:pgMar w:top="1440" w:right="1260" w:bottom="1440" w:left="1260" w:header="708" w:footer="708" w:gutter="0"/>
       <w:cols w:space="720"/>
@@ -17212,12 +17304,12 @@
     <w:rsidRoot w:val="00850A12"/>
     <w:rsid w:val="002F6C15"/>
     <w:rsid w:val="0037025C"/>
-    <w:rsid w:val="0040468A"/>
     <w:rsid w:val="004E5B80"/>
     <w:rsid w:val="00536504"/>
     <w:rsid w:val="005E4781"/>
     <w:rsid w:val="00850A12"/>
     <w:rsid w:val="00883521"/>
+    <w:rsid w:val="008F2B61"/>
     <w:rsid w:val="00A84F4C"/>
     <w:rsid w:val="00D53533"/>
     <w:rsid w:val="00D71BF2"/>

</xml_diff>